<commit_message>
Regenerate proposal documents from latest script
Co-Authored-By: Claude Sonnet 4.6 <noreply@anthropic.com>
</commit_message>
<xml_diff>
--- a/Docs/ADRemediationAgent-Client-Proposal.docx
+++ b/Docs/ADRemediationAgent-Client-Proposal.docx
@@ -1,13 +1,13 @@
 
 <file path=word/document.xml><?xml version="1.0" encoding="utf-8"?>
-<w:document xmlns:w="http://schemas.openxmlformats.org/wordprocessingml/2006/main">
+<w:document xmlns:wpc="http://schemas.microsoft.com/office/word/2010/wordprocessingCanvas" xmlns:cx="http://schemas.microsoft.com/office/drawing/2014/chartex" xmlns:cx1="http://schemas.microsoft.com/office/drawing/2015/9/8/chartex" xmlns:cx2="http://schemas.microsoft.com/office/drawing/2015/10/21/chartex" xmlns:cx3="http://schemas.microsoft.com/office/drawing/2016/5/9/chartex" xmlns:cx4="http://schemas.microsoft.com/office/drawing/2016/5/10/chartex" xmlns:cx5="http://schemas.microsoft.com/office/drawing/2016/5/11/chartex" xmlns:cx6="http://schemas.microsoft.com/office/drawing/2016/5/12/chartex" xmlns:cx7="http://schemas.microsoft.com/office/drawing/2016/5/13/chartex" xmlns:cx8="http://schemas.microsoft.com/office/drawing/2016/5/14/chartex" xmlns:mc="http://schemas.openxmlformats.org/markup-compatibility/2006" xmlns:aink="http://schemas.microsoft.com/office/drawing/2016/ink" xmlns:am3d="http://schemas.microsoft.com/office/drawing/2017/model3d" xmlns:o="urn:schemas-microsoft-com:office:office" xmlns:oel="http://schemas.microsoft.com/office/2019/extlst" xmlns:r="http://schemas.openxmlformats.org/officeDocument/2006/relationships" xmlns:m="http://schemas.openxmlformats.org/officeDocument/2006/math" xmlns:v="urn:schemas-microsoft-com:vml" xmlns:wp14="http://schemas.microsoft.com/office/word/2010/wordprocessingDrawing" xmlns:wp="http://schemas.openxmlformats.org/drawingml/2006/wordprocessingDrawing" xmlns:w10="urn:schemas-microsoft-com:office:word" xmlns:w="http://schemas.openxmlformats.org/wordprocessingml/2006/main" xmlns:w14="http://schemas.microsoft.com/office/word/2010/wordml" xmlns:w15="http://schemas.microsoft.com/office/word/2012/wordml" xmlns:w16cex="http://schemas.microsoft.com/office/word/2018/wordml/cex" xmlns:w16cid="http://schemas.microsoft.com/office/word/2016/wordml/cid" xmlns:w16="http://schemas.microsoft.com/office/word/2018/wordml" xmlns:w16du="http://schemas.microsoft.com/office/word/2023/wordml/word16du" xmlns:w16sdtdh="http://schemas.microsoft.com/office/word/2020/wordml/sdtdatahash" xmlns:w16sdtfl="http://schemas.microsoft.com/office/word/2024/wordml/sdtformatlock" xmlns:w16se="http://schemas.microsoft.com/office/word/2015/wordml/symex" xmlns:wpg="http://schemas.microsoft.com/office/word/2010/wordprocessingGroup" xmlns:wpi="http://schemas.microsoft.com/office/word/2010/wordprocessingInk" xmlns:wne="http://schemas.microsoft.com/office/word/2006/wordml" xmlns:wps="http://schemas.microsoft.com/office/word/2010/wordprocessingShape" mc:Ignorable="w14 w15 w16se w16cid w16 w16cex w16sdtdh w16sdtfl w16du wp14">
   <w:body>
     <w:p>
       <w:pPr>
         <w:pStyle w:val="Title"/>
       </w:pPr>
       <w:r>
-        <w:t xml:space="preserve">Active Directory Remediation and Cleanup</w:t>
+        <w:t>Active Directory Remediation and Cleanup</w:t>
       </w:r>
     </w:p>
     <w:p>
@@ -15,7 +15,7 @@
         <w:pStyle w:val="Subtitle"/>
       </w:pPr>
       <w:r>
-        <w:t xml:space="preserve">Proposal for MetLife</w:t>
+        <w:t>Proposal for MetLife</w:t>
       </w:r>
     </w:p>
     <w:p/>
@@ -30,7 +30,7 @@
         <w:t xml:space="preserve">Prepared for:  </w:t>
       </w:r>
       <w:r>
-        <w:t xml:space="preserve">MetLife</w:t>
+        <w:t>MetLife</w:t>
       </w:r>
     </w:p>
     <w:p>
@@ -44,7 +44,7 @@
         <w:t xml:space="preserve">Prepared by:  </w:t>
       </w:r>
       <w:r>
-        <w:t xml:space="preserve">Fusion5</w:t>
+        <w:t>Fusion5</w:t>
       </w:r>
     </w:p>
     <w:p>
@@ -58,7 +58,7 @@
         <w:t xml:space="preserve">Date:  </w:t>
       </w:r>
       <w:r>
-        <w:t xml:space="preserve">March 2026</w:t>
+        <w:t>March 2026</w:t>
       </w:r>
     </w:p>
     <w:p>
@@ -72,7 +72,7 @@
         <w:t xml:space="preserve">Classification:  </w:t>
       </w:r>
       <w:r>
-        <w:t xml:space="preserve">COMMERCIAL IN CONFIDENCE</w:t>
+        <w:t>COMMERCIAL IN CONFIDENCE</w:t>
       </w:r>
     </w:p>
     <w:p/>
@@ -86,22 +86,39 @@
         <w:pStyle w:val="Heading1"/>
       </w:pPr>
       <w:r>
-        <w:t xml:space="preserve">Background and Understanding</w:t>
-      </w:r>
-    </w:p>
-    <w:p>
-      <w:r>
-        <w:t xml:space="preserve">Thank you for the time you and your team invested in our initial discussion. Following that conversation, Fusion5 has prepared this proposal based on the context you shared and the scope areas we worked through together. We understand that a recent issue impacting mapped drives has brought into focus the need to prioritise Active Directory remediation and cleanup activities within your on-premise AD environment, and that MetLife is looking to move forward with this work in a structured and timely way.</w:t>
-      </w:r>
-    </w:p>
-    <w:p>
-      <w:r>
-        <w:t xml:space="preserve">This proposal reflects the requirements and priorities discussed during our call. Where our initial conversation provided additional detail or nuance beyond the original scope brief -- for example, around the hybrid Azure AD Join configuration, the Windows Hello for Business Kerberos hybrid trust topology, and application dependencies on DC IP addresses -- we have incorporated that context into the proposed approach and phasing.</w:t>
-      </w:r>
-    </w:p>
-    <w:p>
-      <w:r>
-        <w:t xml:space="preserve">Our proposed solution addresses all eleven areas identified in your scope. The Scope Coverage section below maps each of your requirements directly to the components we will deliver, so you can confirm at a glance that nothing has been missed.</w:t>
+        <w:lastRenderedPageBreak/>
+        <w:t>Background and Understanding</w:t>
+      </w:r>
+    </w:p>
+    <w:p>
+      <w:r>
+        <w:t xml:space="preserve">Thank you for the time you and your team invested in our initial discussion. Following that conversation, Fusion5 has prepared this proposal based on the context you shared and the scope areas we worked through together. We understand that a recent issue impacting mapped drives has brought into focus the need to prioritise Active Directory remediation and cleanup activities within your </w:t>
+      </w:r>
+      <w:proofErr w:type="gramStart"/>
+      <w:r>
+        <w:t>on-premise</w:t>
+      </w:r>
+      <w:proofErr w:type="gramEnd"/>
+      <w:r>
+        <w:t xml:space="preserve"> AD environment, and that MetLife is looking to move forward with this work in a structured and timely way.</w:t>
+      </w:r>
+    </w:p>
+    <w:p>
+      <w:r>
+        <w:t>This proposal reflects the requirements and priorities discussed during our call. Where our initial conversation provided additional detail or nuance beyond the original scope brief -- for example, around the hybrid Azure AD Join configuration, the Windows Hello for Business Kerberos hybrid trust topology, and application dependencies on DC IP addresses -- we have incorporated that context into the proposed approach and phasing.</w:t>
+      </w:r>
+    </w:p>
+    <w:p>
+      <w:r>
+        <w:t xml:space="preserve">Our proposed solution addresses all eleven areas identified in your scope. The Scope Coverage section below maps each of your requirements directly to the components we will deliver, so you can confirm </w:t>
+      </w:r>
+      <w:proofErr w:type="gramStart"/>
+      <w:r>
+        <w:t>at a glance</w:t>
+      </w:r>
+      <w:proofErr w:type="gramEnd"/>
+      <w:r>
+        <w:t xml:space="preserve"> that nothing has been missed.</w:t>
       </w:r>
     </w:p>
     <w:p>
@@ -109,17 +126,17 @@
         <w:pStyle w:val="Heading1"/>
       </w:pPr>
       <w:r>
-        <w:t xml:space="preserve">Proposed Solution</w:t>
-      </w:r>
-    </w:p>
-    <w:p>
-      <w:r>
-        <w:t xml:space="preserve">To deliver this engagement, Fusion5 proposes to develop and deploy the AD Remediation Agent -- a purpose-built PowerShell automation framework designed specifically around MetLife's stated requirements. The agent will run directly from any domain-joined Windows machine or Privileged Access Workstation and requires no additional software, licensing, or infrastructure beyond the standard Windows Remote Server Administration Tools (RSAT) that are already available in your environment.</w:t>
-      </w:r>
-    </w:p>
-    <w:p>
-      <w:r>
-        <w:t xml:space="preserve">The agent will operate in four modes, giving MetLife full control over discovery, remediation, and ongoing monitoring:</w:t>
+        <w:t>Proposed Solution</w:t>
+      </w:r>
+    </w:p>
+    <w:p>
+      <w:r>
+        <w:t>To deliver this engagement, Fusion5 proposes to develop and deploy the AD Remediation Agent -- a purpose-built PowerShell automation framework designed specifically around MetLife's stated requirements. The agent will run directly from any domain-joined Windows machine or Privileged Access Workstation and requires no additional software, licensing, or infrastructure beyond the standard Windows Remote Server Administration Tools (RSAT) that are already available in your environment.</w:t>
+      </w:r>
+    </w:p>
+    <w:p>
+      <w:r>
+        <w:t>The agent will operate in four modes, giving MetLife full control over discovery, remediation, and ongoing monitoring:</w:t>
       </w:r>
     </w:p>
     <w:p/>
@@ -127,6 +144,14 @@
       <w:tblPr>
         <w:tblStyle w:val="TableGrid"/>
         <w:tblW w:w="9360" w:type="dxa"/>
+        <w:tblInd w:w="5" w:type="dxa"/>
+        <w:tblCellMar>
+          <w:top w:w="0" w:type="dxa"/>
+          <w:left w:w="0" w:type="dxa"/>
+          <w:bottom w:w="0" w:type="dxa"/>
+          <w:right w:w="0" w:type="dxa"/>
+        </w:tblCellMar>
+        <w:tblLook w:val="04A0" w:firstRow="1" w:lastRow="0" w:firstColumn="1" w:lastColumn="0" w:noHBand="0" w:noVBand="1"/>
       </w:tblPr>
       <w:tblGrid>
         <w:gridCol w:w="3120"/>
@@ -134,6 +159,14 @@
         <w:gridCol w:w="3120"/>
       </w:tblGrid>
       <w:tr>
+        <w:tblPrEx>
+          <w:tblCellMar>
+            <w:top w:w="0" w:type="dxa"/>
+            <w:left w:w="0" w:type="dxa"/>
+            <w:bottom w:w="0" w:type="dxa"/>
+            <w:right w:w="0" w:type="dxa"/>
+          </w:tblCellMar>
+        </w:tblPrEx>
         <w:tc>
           <w:tcPr>
             <w:tcW w:w="3120" w:type="dxa"/>
@@ -148,7 +181,7 @@
                 <w:b/>
                 <w:color w:val="FFFFFF"/>
               </w:rPr>
-              <w:t xml:space="preserve">Mode</w:t>
+              <w:t>Mode</w:t>
             </w:r>
           </w:p>
         </w:tc>
@@ -166,7 +199,7 @@
                 <w:b/>
                 <w:color w:val="FFFFFF"/>
               </w:rPr>
-              <w:t xml:space="preserve">Purpose</w:t>
+              <w:t>Purpose</w:t>
             </w:r>
           </w:p>
         </w:tc>
@@ -184,12 +217,20 @@
                 <w:b/>
                 <w:color w:val="FFFFFF"/>
               </w:rPr>
-              <w:t xml:space="preserve">Changes to Active Directory</w:t>
+              <w:t>Changes to Active Directory</w:t>
             </w:r>
           </w:p>
         </w:tc>
       </w:tr>
       <w:tr>
+        <w:tblPrEx>
+          <w:tblCellMar>
+            <w:top w:w="0" w:type="dxa"/>
+            <w:left w:w="0" w:type="dxa"/>
+            <w:bottom w:w="0" w:type="dxa"/>
+            <w:right w:w="0" w:type="dxa"/>
+          </w:tblCellMar>
+        </w:tblPrEx>
         <w:tc>
           <w:tcPr>
             <w:tcW w:w="3120" w:type="dxa"/>
@@ -200,7 +241,7 @@
               <w:spacing w:after="80"/>
             </w:pPr>
             <w:r>
-              <w:t xml:space="preserve">Discover</w:t>
+              <w:t>Discover</w:t>
             </w:r>
           </w:p>
         </w:tc>
@@ -214,7 +255,19 @@
               <w:spacing w:after="80"/>
             </w:pPr>
             <w:r>
-              <w:t xml:space="preserve">Runs all assessment checks across every in-scope area and produces a findings report annotated with CIS Benchmark Level 1 control references. Safe to run at any time -- no changes are made.</w:t>
+              <w:t xml:space="preserve">Runs all assessment checks across every in-scope area and produces </w:t>
+            </w:r>
+            <w:proofErr w:type="gramStart"/>
+            <w:r>
+              <w:t>a findings</w:t>
+            </w:r>
+            <w:proofErr w:type="gramEnd"/>
+            <w:r>
+              <w:t xml:space="preserve"> report annotated with CIS Benchmark Level 1 control references. Safe </w:t>
+            </w:r>
+            <w:r>
+              <w:lastRenderedPageBreak/>
+              <w:t>to run at any time -- no changes are made.</w:t>
             </w:r>
           </w:p>
         </w:tc>
@@ -228,12 +281,21 @@
               <w:spacing w:after="80"/>
             </w:pPr>
             <w:r>
-              <w:t xml:space="preserve">None</w:t>
+              <w:lastRenderedPageBreak/>
+              <w:t>None</w:t>
             </w:r>
           </w:p>
         </w:tc>
       </w:tr>
       <w:tr>
+        <w:tblPrEx>
+          <w:tblCellMar>
+            <w:top w:w="0" w:type="dxa"/>
+            <w:left w:w="0" w:type="dxa"/>
+            <w:bottom w:w="0" w:type="dxa"/>
+            <w:right w:w="0" w:type="dxa"/>
+          </w:tblCellMar>
+        </w:tblPrEx>
         <w:tc>
           <w:tcPr>
             <w:tcW w:w="3120" w:type="dxa"/>
@@ -244,7 +306,7 @@
               <w:spacing w:after="80"/>
             </w:pPr>
             <w:r>
-              <w:t xml:space="preserve">Baseline</w:t>
+              <w:t>Baseline</w:t>
             </w:r>
           </w:p>
         </w:tc>
@@ -258,7 +320,7 @@
               <w:spacing w:after="80"/>
             </w:pPr>
             <w:r>
-              <w:t xml:space="preserve">Snapshots the current state of Active Directory as the approved reference point. All subsequent Discover or Remediate runs compare against this snapshot, highlighting what is new, persisting, or resolved.</w:t>
+              <w:t>Snapshots the current state of Active Directory as the approved reference point. All subsequent Discover or Remediate runs compare against this snapshot, highlighting what is new, persisting, or resolved.</w:t>
             </w:r>
           </w:p>
         </w:tc>
@@ -272,12 +334,20 @@
               <w:spacing w:after="80"/>
             </w:pPr>
             <w:r>
-              <w:t xml:space="preserve">None</w:t>
+              <w:t>None</w:t>
             </w:r>
           </w:p>
         </w:tc>
       </w:tr>
       <w:tr>
+        <w:tblPrEx>
+          <w:tblCellMar>
+            <w:top w:w="0" w:type="dxa"/>
+            <w:left w:w="0" w:type="dxa"/>
+            <w:bottom w:w="0" w:type="dxa"/>
+            <w:right w:w="0" w:type="dxa"/>
+          </w:tblCellMar>
+        </w:tblPrEx>
         <w:tc>
           <w:tcPr>
             <w:tcW w:w="3120" w:type="dxa"/>
@@ -288,7 +358,7 @@
               <w:spacing w:after="80"/>
             </w:pPr>
             <w:r>
-              <w:t xml:space="preserve">Remediate</w:t>
+              <w:t>Remediate</w:t>
             </w:r>
           </w:p>
         </w:tc>
@@ -302,7 +372,7 @@
               <w:spacing w:after="80"/>
             </w:pPr>
             <w:r>
-              <w:t xml:space="preserve">Runs all checks and presents each finding to the operator with full impact detail, rollback steps, and an explicit approve-or-skip prompt. No action is taken without the operator's deliberate approval.</w:t>
+              <w:t>Runs all checks and presents each finding to the operator with full impact detail, rollback steps, and an explicit approve-or-skip prompt. No action is taken without the operator's deliberate approval.</w:t>
             </w:r>
           </w:p>
         </w:tc>
@@ -316,12 +386,20 @@
               <w:spacing w:after="80"/>
             </w:pPr>
             <w:r>
-              <w:t xml:space="preserve">Yes -- with explicit operator approval only</w:t>
+              <w:t>Yes -- with explicit operator approval only</w:t>
             </w:r>
           </w:p>
         </w:tc>
       </w:tr>
       <w:tr>
+        <w:tblPrEx>
+          <w:tblCellMar>
+            <w:top w:w="0" w:type="dxa"/>
+            <w:left w:w="0" w:type="dxa"/>
+            <w:bottom w:w="0" w:type="dxa"/>
+            <w:right w:w="0" w:type="dxa"/>
+          </w:tblCellMar>
+        </w:tblPrEx>
         <w:tc>
           <w:tcPr>
             <w:tcW w:w="3120" w:type="dxa"/>
@@ -332,7 +410,7 @@
               <w:spacing w:after="80"/>
             </w:pPr>
             <w:r>
-              <w:t xml:space="preserve">Report</w:t>
+              <w:t>Report</w:t>
             </w:r>
           </w:p>
         </w:tc>
@@ -346,7 +424,7 @@
               <w:spacing w:after="80"/>
             </w:pPr>
             <w:r>
-              <w:t xml:space="preserve">Generates a management-ready drift report from stored baseline data. No Active Directory connection required.</w:t>
+              <w:t>Generates a management-ready drift report from stored baseline data. No Active Directory connection required.</w:t>
             </w:r>
           </w:p>
         </w:tc>
@@ -360,7 +438,7 @@
               <w:spacing w:after="80"/>
             </w:pPr>
             <w:r>
-              <w:t xml:space="preserve">None</w:t>
+              <w:t>None</w:t>
             </w:r>
           </w:p>
         </w:tc>
@@ -369,7 +447,7 @@
     <w:p/>
     <w:p>
       <w:r>
-        <w:t xml:space="preserve">Every run produces a structured HTML report and a CSV activity log. All findings are mapped to CIS Benchmark Level 1 controls (Windows Server 2022/2025) and NIST SP 800-53 control identifiers, making the output directly suitable for audit evidence packages and risk register updates.</w:t>
+        <w:t>Every run produces a structured HTML report and a CSV activity log. All findings are mapped to CIS Benchmark Level 1 controls (Windows Server 2022/2025) and NIST SP 800-53 control identifiers, making the output directly suitable for audit evidence packages and risk register updates.</w:t>
       </w:r>
     </w:p>
     <w:p>
@@ -377,12 +455,12 @@
         <w:pStyle w:val="Heading1"/>
       </w:pPr>
       <w:r>
-        <w:t xml:space="preserve">Scope Coverage</w:t>
-      </w:r>
-    </w:p>
-    <w:p>
-      <w:r>
-        <w:t xml:space="preserve">The table below maps each requirement from your engagement brief to the corresponding milestone in our proposed solution. All eleven scripted milestones are fully automated for assessment. Remediation -- where applicable -- is available with explicit operator approval at each step.</w:t>
+        <w:t>Scope Coverage</w:t>
+      </w:r>
+    </w:p>
+    <w:p>
+      <w:r>
+        <w:t>The table below maps each requirement from your engagement brief to the corresponding milestone in our proposed solution. All eleven scripted milestones are fully automated for assessment. Remediation -- where applicable -- is available with explicit operator approval at each step.</w:t>
       </w:r>
     </w:p>
     <w:p/>
@@ -390,6 +468,14 @@
       <w:tblPr>
         <w:tblStyle w:val="TableGrid"/>
         <w:tblW w:w="9360" w:type="dxa"/>
+        <w:tblInd w:w="5" w:type="dxa"/>
+        <w:tblCellMar>
+          <w:top w:w="0" w:type="dxa"/>
+          <w:left w:w="0" w:type="dxa"/>
+          <w:bottom w:w="0" w:type="dxa"/>
+          <w:right w:w="0" w:type="dxa"/>
+        </w:tblCellMar>
+        <w:tblLook w:val="04A0" w:firstRow="1" w:lastRow="0" w:firstColumn="1" w:lastColumn="0" w:noHBand="0" w:noVBand="1"/>
       </w:tblPr>
       <w:tblGrid>
         <w:gridCol w:w="3120"/>
@@ -397,6 +483,14 @@
         <w:gridCol w:w="3120"/>
       </w:tblGrid>
       <w:tr>
+        <w:tblPrEx>
+          <w:tblCellMar>
+            <w:top w:w="0" w:type="dxa"/>
+            <w:left w:w="0" w:type="dxa"/>
+            <w:bottom w:w="0" w:type="dxa"/>
+            <w:right w:w="0" w:type="dxa"/>
+          </w:tblCellMar>
+        </w:tblPrEx>
         <w:tc>
           <w:tcPr>
             <w:tcW w:w="3120" w:type="dxa"/>
@@ -411,7 +505,7 @@
                 <w:b/>
                 <w:color w:val="FFFFFF"/>
               </w:rPr>
-              <w:t xml:space="preserve">Your Requirement</w:t>
+              <w:t>Your Requirement</w:t>
             </w:r>
           </w:p>
         </w:tc>
@@ -429,7 +523,7 @@
                 <w:b/>
                 <w:color w:val="FFFFFF"/>
               </w:rPr>
-              <w:t xml:space="preserve">Milestone(s)</w:t>
+              <w:t>Milestone(s)</w:t>
             </w:r>
           </w:p>
         </w:tc>
@@ -447,12 +541,20 @@
                 <w:b/>
                 <w:color w:val="FFFFFF"/>
               </w:rPr>
-              <w:t xml:space="preserve">How We Will Address It</w:t>
+              <w:t>How We Will Address It</w:t>
             </w:r>
           </w:p>
         </w:tc>
       </w:tr>
       <w:tr>
+        <w:tblPrEx>
+          <w:tblCellMar>
+            <w:top w:w="0" w:type="dxa"/>
+            <w:left w:w="0" w:type="dxa"/>
+            <w:bottom w:w="0" w:type="dxa"/>
+            <w:right w:w="0" w:type="dxa"/>
+          </w:tblCellMar>
+        </w:tblPrEx>
         <w:tc>
           <w:tcPr>
             <w:tcW w:w="3120" w:type="dxa"/>
@@ -463,7 +565,8 @@
               <w:spacing w:after="80"/>
             </w:pPr>
             <w:r>
-              <w:t xml:space="preserve">Upgrade Domain Controllers to Windows Server 2025</w:t>
+              <w:lastRenderedPageBreak/>
+              <w:t>Upgrade Domain Controllers to Windows Server 2025</w:t>
             </w:r>
           </w:p>
         </w:tc>
@@ -477,7 +580,7 @@
               <w:spacing w:after="80"/>
             </w:pPr>
             <w:r>
-              <w:t xml:space="preserve">M1, M2</w:t>
+              <w:t>M1, M2</w:t>
             </w:r>
           </w:p>
         </w:tc>
@@ -491,12 +594,20 @@
               <w:spacing w:after="80"/>
             </w:pPr>
             <w:r>
-              <w:t xml:space="preserve">M1 produces a DC health and upgrade readiness report. M2 is the upgrade itself -- Fusion5 will lead the migration planning and execution.</w:t>
+              <w:t>M1 produces a DC health and upgrade readiness report. M2 is the upgrade itself -- Fusion5 will lead the migration planning and execution.</w:t>
             </w:r>
           </w:p>
         </w:tc>
       </w:tr>
       <w:tr>
+        <w:tblPrEx>
+          <w:tblCellMar>
+            <w:top w:w="0" w:type="dxa"/>
+            <w:left w:w="0" w:type="dxa"/>
+            <w:bottom w:w="0" w:type="dxa"/>
+            <w:right w:w="0" w:type="dxa"/>
+          </w:tblCellMar>
+        </w:tblPrEx>
         <w:tc>
           <w:tcPr>
             <w:tcW w:w="3120" w:type="dxa"/>
@@ -507,7 +618,7 @@
               <w:spacing w:after="80"/>
             </w:pPr>
             <w:r>
-              <w:t xml:space="preserve">Active Directory structure cleanup and hygiene improvements</w:t>
+              <w:t>Active Directory structure cleanup and hygiene improvements</w:t>
             </w:r>
           </w:p>
         </w:tc>
@@ -521,7 +632,7 @@
               <w:spacing w:after="80"/>
             </w:pPr>
             <w:r>
-              <w:t xml:space="preserve">M3</w:t>
+              <w:t>M3</w:t>
             </w:r>
           </w:p>
         </w:tc>
@@ -535,12 +646,20 @@
               <w:spacing w:after="80"/>
             </w:pPr>
             <w:r>
-              <w:t xml:space="preserve">OU inventory, default container usage, empty OUs, block inheritance gaps, and non-standard OU delegation are assessed and reported.</w:t>
+              <w:t>OU inventory, default container usage, empty OUs, block inheritance gaps, and non-standard OU delegation are assessed and reported.</w:t>
             </w:r>
           </w:p>
         </w:tc>
       </w:tr>
       <w:tr>
+        <w:tblPrEx>
+          <w:tblCellMar>
+            <w:top w:w="0" w:type="dxa"/>
+            <w:left w:w="0" w:type="dxa"/>
+            <w:bottom w:w="0" w:type="dxa"/>
+            <w:right w:w="0" w:type="dxa"/>
+          </w:tblCellMar>
+        </w:tblPrEx>
         <w:tc>
           <w:tcPr>
             <w:tcW w:w="3120" w:type="dxa"/>
@@ -551,7 +670,7 @@
               <w:spacing w:after="80"/>
             </w:pPr>
             <w:r>
-              <w:t xml:space="preserve">Review and remediate unconstrained delegation</w:t>
+              <w:t>Review and remediate unconstrained delegation</w:t>
             </w:r>
           </w:p>
         </w:tc>
@@ -565,7 +684,7 @@
               <w:spacing w:after="80"/>
             </w:pPr>
             <w:r>
-              <w:t xml:space="preserve">M4</w:t>
+              <w:t>M4</w:t>
             </w:r>
           </w:p>
         </w:tc>
@@ -579,12 +698,20 @@
               <w:spacing w:after="80"/>
             </w:pPr>
             <w:r>
-              <w:t xml:space="preserve">All computer and user accounts with unconstrained Kerberos delegation (excluding DCs) are identified and delegation can be removed with approval.</w:t>
+              <w:t>All computer and user accounts with unconstrained Kerberos delegation (excluding DCs) are identified and delegation can be removed with approval.</w:t>
             </w:r>
           </w:p>
         </w:tc>
       </w:tr>
       <w:tr>
+        <w:tblPrEx>
+          <w:tblCellMar>
+            <w:top w:w="0" w:type="dxa"/>
+            <w:left w:w="0" w:type="dxa"/>
+            <w:bottom w:w="0" w:type="dxa"/>
+            <w:right w:w="0" w:type="dxa"/>
+          </w:tblCellMar>
+        </w:tblPrEx>
         <w:tc>
           <w:tcPr>
             <w:tcW w:w="3120" w:type="dxa"/>
@@ -595,7 +722,7 @@
               <w:spacing w:after="80"/>
             </w:pPr>
             <w:r>
-              <w:t xml:space="preserve">Identify duplicate or incorrect Service Principal Names (SPNs)</w:t>
+              <w:t>Identify duplicate or incorrect Service Principal Names (SPNs)</w:t>
             </w:r>
           </w:p>
         </w:tc>
@@ -609,7 +736,7 @@
               <w:spacing w:after="80"/>
             </w:pPr>
             <w:r>
-              <w:t xml:space="preserve">M5</w:t>
+              <w:t>M5</w:t>
             </w:r>
           </w:p>
         </w:tc>
@@ -623,12 +750,28 @@
               <w:spacing w:after="80"/>
             </w:pPr>
             <w:r>
-              <w:t xml:space="preserve">Duplicate SPNs, Kerberoastable accounts, SPNs on disabled accounts, and Tier 0 accounts with SPNs are flagged and reported.</w:t>
+              <w:t xml:space="preserve">Duplicate SPNs, </w:t>
+            </w:r>
+            <w:proofErr w:type="spellStart"/>
+            <w:r>
+              <w:t>Kerberoastable</w:t>
+            </w:r>
+            <w:proofErr w:type="spellEnd"/>
+            <w:r>
+              <w:t xml:space="preserve"> accounts, SPNs on disabled accounts, and Tier 0 accounts with SPNs are flagged and reported.</w:t>
             </w:r>
           </w:p>
         </w:tc>
       </w:tr>
       <w:tr>
+        <w:tblPrEx>
+          <w:tblCellMar>
+            <w:top w:w="0" w:type="dxa"/>
+            <w:left w:w="0" w:type="dxa"/>
+            <w:bottom w:w="0" w:type="dxa"/>
+            <w:right w:w="0" w:type="dxa"/>
+          </w:tblCellMar>
+        </w:tblPrEx>
         <w:tc>
           <w:tcPr>
             <w:tcW w:w="3120" w:type="dxa"/>
@@ -639,7 +782,7 @@
               <w:spacing w:after="80"/>
             </w:pPr>
             <w:r>
-              <w:t xml:space="preserve">Review Kerberos configuration including encryption types and authentication settings</w:t>
+              <w:t>Review Kerberos configuration including encryption types and authentication settings</w:t>
             </w:r>
           </w:p>
         </w:tc>
@@ -653,7 +796,7 @@
               <w:spacing w:after="80"/>
             </w:pPr>
             <w:r>
-              <w:t xml:space="preserve">M6</w:t>
+              <w:t>M6</w:t>
             </w:r>
           </w:p>
         </w:tc>
@@ -667,12 +810,28 @@
               <w:spacing w:after="80"/>
             </w:pPr>
             <w:r>
-              <w:t xml:space="preserve">RC4-only accounts, ticket policy, WHfB Kerberos hybrid trust, and authentication policy gaps are assessed. AES encryption types can be enforced with approval.</w:t>
+              <w:t xml:space="preserve">RC4-only accounts, ticket policy, </w:t>
+            </w:r>
+            <w:proofErr w:type="spellStart"/>
+            <w:r>
+              <w:t>WHfB</w:t>
+            </w:r>
+            <w:proofErr w:type="spellEnd"/>
+            <w:r>
+              <w:t xml:space="preserve"> Kerberos hybrid trust, and authentication policy gaps are assessed. AES encryption types can be enforced with approval.</w:t>
             </w:r>
           </w:p>
         </w:tc>
       </w:tr>
       <w:tr>
+        <w:tblPrEx>
+          <w:tblCellMar>
+            <w:top w:w="0" w:type="dxa"/>
+            <w:left w:w="0" w:type="dxa"/>
+            <w:bottom w:w="0" w:type="dxa"/>
+            <w:right w:w="0" w:type="dxa"/>
+          </w:tblCellMar>
+        </w:tblPrEx>
         <w:tc>
           <w:tcPr>
             <w:tcW w:w="3120" w:type="dxa"/>
@@ -683,7 +842,7 @@
               <w:spacing w:after="80"/>
             </w:pPr>
             <w:r>
-              <w:t xml:space="preserve">Domain Controller hardening including auditing and security baseline review</w:t>
+              <w:t>Domain Controller hardening including auditing and security baseline review</w:t>
             </w:r>
           </w:p>
         </w:tc>
@@ -697,7 +856,7 @@
               <w:spacing w:after="80"/>
             </w:pPr>
             <w:r>
-              <w:t xml:space="preserve">M7</w:t>
+              <w:t>M7</w:t>
             </w:r>
           </w:p>
         </w:tc>
@@ -711,12 +870,28 @@
               <w:spacing w:after="80"/>
             </w:pPr>
             <w:r>
-              <w:t xml:space="preserve">12 CIS Level 1 checks run remotely against each DC via WinRM: LDAP signing, SMB signing, NLA, Print Spooler, LSASS protection, Credential Guard, audit policy, and more.</w:t>
+              <w:t xml:space="preserve">12 CIS Level 1 checks run remotely against each DC via </w:t>
+            </w:r>
+            <w:proofErr w:type="spellStart"/>
+            <w:r>
+              <w:t>WinRM</w:t>
+            </w:r>
+            <w:proofErr w:type="spellEnd"/>
+            <w:r>
+              <w:t>: LDAP signing, SMB signing, NLA, Print Spooler, LSASS protection, Credential Guard, audit policy, and more.</w:t>
             </w:r>
           </w:p>
         </w:tc>
       </w:tr>
       <w:tr>
+        <w:tblPrEx>
+          <w:tblCellMar>
+            <w:top w:w="0" w:type="dxa"/>
+            <w:left w:w="0" w:type="dxa"/>
+            <w:bottom w:w="0" w:type="dxa"/>
+            <w:right w:w="0" w:type="dxa"/>
+          </w:tblCellMar>
+        </w:tblPrEx>
         <w:tc>
           <w:tcPr>
             <w:tcW w:w="3120" w:type="dxa"/>
@@ -727,7 +902,7 @@
               <w:spacing w:after="80"/>
             </w:pPr>
             <w:r>
-              <w:t xml:space="preserve">Group Policy cleanup -- redundant, unused or conflicting GPOs</w:t>
+              <w:t>Group Policy cleanup -- redundant, unused or conflicting GPOs</w:t>
             </w:r>
           </w:p>
         </w:tc>
@@ -741,7 +916,7 @@
               <w:spacing w:after="80"/>
             </w:pPr>
             <w:r>
-              <w:t xml:space="preserve">M8</w:t>
+              <w:t>M8</w:t>
             </w:r>
           </w:p>
         </w:tc>
@@ -755,12 +930,24 @@
               <w:spacing w:after="80"/>
             </w:pPr>
             <w:r>
-              <w:t xml:space="preserve">Unlinked, empty, disabled, and orphaned GPOs are identified. GPOs are backed up before any disable or delete action is taken with approval.</w:t>
+              <w:t xml:space="preserve">Unlinked, empty, disabled, and orphaned GPOs are identified. GPOs are backed up before any disable or delete action is taken </w:t>
+            </w:r>
+            <w:r>
+              <w:lastRenderedPageBreak/>
+              <w:t>with approval.</w:t>
             </w:r>
           </w:p>
         </w:tc>
       </w:tr>
       <w:tr>
+        <w:tblPrEx>
+          <w:tblCellMar>
+            <w:top w:w="0" w:type="dxa"/>
+            <w:left w:w="0" w:type="dxa"/>
+            <w:bottom w:w="0" w:type="dxa"/>
+            <w:right w:w="0" w:type="dxa"/>
+          </w:tblCellMar>
+        </w:tblPrEx>
         <w:tc>
           <w:tcPr>
             <w:tcW w:w="3120" w:type="dxa"/>
@@ -771,7 +958,8 @@
               <w:spacing w:after="80"/>
             </w:pPr>
             <w:r>
-              <w:t xml:space="preserve">Identify and clean up unused or redundant security groups and OUs</w:t>
+              <w:lastRenderedPageBreak/>
+              <w:t>Identify and clean up unused or redundant security groups and OUs</w:t>
             </w:r>
           </w:p>
         </w:tc>
@@ -785,7 +973,7 @@
               <w:spacing w:after="80"/>
             </w:pPr>
             <w:r>
-              <w:t xml:space="preserve">M3, M9</w:t>
+              <w:t>M3, M9</w:t>
             </w:r>
           </w:p>
         </w:tc>
@@ -799,12 +987,28 @@
               <w:spacing w:after="80"/>
             </w:pPr>
             <w:r>
-              <w:t xml:space="preserve">M3 audits empty and redundant OUs. M9 identifies empty groups, disabled account memberships, circular nesting, and AdminSDHolder remnants.</w:t>
+              <w:t xml:space="preserve">M3 audits empty and redundant OUs. M9 identifies empty groups, disabled account memberships, circular nesting, and </w:t>
+            </w:r>
+            <w:proofErr w:type="spellStart"/>
+            <w:r>
+              <w:t>AdminSDHolder</w:t>
+            </w:r>
+            <w:proofErr w:type="spellEnd"/>
+            <w:r>
+              <w:t xml:space="preserve"> remnants.</w:t>
             </w:r>
           </w:p>
         </w:tc>
       </w:tr>
       <w:tr>
+        <w:tblPrEx>
+          <w:tblCellMar>
+            <w:top w:w="0" w:type="dxa"/>
+            <w:left w:w="0" w:type="dxa"/>
+            <w:bottom w:w="0" w:type="dxa"/>
+            <w:right w:w="0" w:type="dxa"/>
+          </w:tblCellMar>
+        </w:tblPrEx>
         <w:tc>
           <w:tcPr>
             <w:tcW w:w="3120" w:type="dxa"/>
@@ -815,7 +1019,7 @@
               <w:spacing w:after="80"/>
             </w:pPr>
             <w:r>
-              <w:t xml:space="preserve">Review delegated permissions and remove unnecessary elevated access</w:t>
+              <w:t>Review delegated permissions and remove unnecessary elevated access</w:t>
             </w:r>
           </w:p>
         </w:tc>
@@ -829,7 +1033,7 @@
               <w:spacing w:after="80"/>
             </w:pPr>
             <w:r>
-              <w:t xml:space="preserve">M10</w:t>
+              <w:t>M10</w:t>
             </w:r>
           </w:p>
         </w:tc>
@@ -842,13 +1046,42 @@
             <w:pPr>
               <w:spacing w:after="80"/>
             </w:pPr>
-            <w:r>
-              <w:t xml:space="preserve">DCSync rights, domain root ACEs, AdminSDHolder ACEs, DC OU delegation, DnsAdmins membership, and DC object delegation are all assessed. DC OU ACE removal is available with approval.</w:t>
+            <w:proofErr w:type="spellStart"/>
+            <w:r>
+              <w:t>DCSync</w:t>
+            </w:r>
+            <w:proofErr w:type="spellEnd"/>
+            <w:r>
+              <w:t xml:space="preserve"> rights, domain root ACEs, </w:t>
+            </w:r>
+            <w:proofErr w:type="spellStart"/>
+            <w:r>
+              <w:t>AdminSDHolder</w:t>
+            </w:r>
+            <w:proofErr w:type="spellEnd"/>
+            <w:r>
+              <w:t xml:space="preserve"> ACEs, DC OU delegation, </w:t>
+            </w:r>
+            <w:proofErr w:type="spellStart"/>
+            <w:r>
+              <w:t>DnsAdmins</w:t>
+            </w:r>
+            <w:proofErr w:type="spellEnd"/>
+            <w:r>
+              <w:t xml:space="preserve"> membership, and DC object delegation are all assessed. DC OU ACE removal is available with approval.</w:t>
             </w:r>
           </w:p>
         </w:tc>
       </w:tr>
       <w:tr>
+        <w:tblPrEx>
+          <w:tblCellMar>
+            <w:top w:w="0" w:type="dxa"/>
+            <w:left w:w="0" w:type="dxa"/>
+            <w:bottom w:w="0" w:type="dxa"/>
+            <w:right w:w="0" w:type="dxa"/>
+          </w:tblCellMar>
+        </w:tblPrEx>
         <w:tc>
           <w:tcPr>
             <w:tcW w:w="3120" w:type="dxa"/>
@@ -859,7 +1092,7 @@
               <w:spacing w:after="80"/>
             </w:pPr>
             <w:r>
-              <w:t xml:space="preserve">Identify and remove stale or inactive user, computer and service accounts</w:t>
+              <w:t>Identify and remove stale or inactive user, computer and service accounts</w:t>
             </w:r>
           </w:p>
         </w:tc>
@@ -873,7 +1106,7 @@
               <w:spacing w:after="80"/>
             </w:pPr>
             <w:r>
-              <w:t xml:space="preserve">M11</w:t>
+              <w:t>M11</w:t>
             </w:r>
           </w:p>
         </w:tc>
@@ -887,12 +1120,20 @@
               <w:spacing w:after="80"/>
             </w:pPr>
             <w:r>
-              <w:t xml:space="preserve">Accounts inactive beyond a configurable threshold (default 90 days) are identified. Bulk quarantine (disable and move to Quarantine OU) is available with approval.</w:t>
+              <w:t>Accounts inactive beyond a configurable threshold (default 90 days) are identified. Bulk quarantine (disable and move to Quarantine OU) is available with approval.</w:t>
             </w:r>
           </w:p>
         </w:tc>
       </w:tr>
       <w:tr>
+        <w:tblPrEx>
+          <w:tblCellMar>
+            <w:top w:w="0" w:type="dxa"/>
+            <w:left w:w="0" w:type="dxa"/>
+            <w:bottom w:w="0" w:type="dxa"/>
+            <w:right w:w="0" w:type="dxa"/>
+          </w:tblCellMar>
+        </w:tblPrEx>
         <w:tc>
           <w:tcPr>
             <w:tcW w:w="3120" w:type="dxa"/>
@@ -903,7 +1144,7 @@
               <w:spacing w:after="80"/>
             </w:pPr>
             <w:r>
-              <w:t xml:space="preserve">Review and clean up privileged AD groups including Domain Admins</w:t>
+              <w:t>Review and clean up privileged AD groups including Domain Admins</w:t>
             </w:r>
           </w:p>
         </w:tc>
@@ -917,7 +1158,7 @@
               <w:spacing w:after="80"/>
             </w:pPr>
             <w:r>
-              <w:t xml:space="preserve">M12</w:t>
+              <w:t>M12</w:t>
             </w:r>
           </w:p>
         </w:tc>
@@ -931,7 +1172,7 @@
               <w:spacing w:after="80"/>
             </w:pPr>
             <w:r>
-              <w:t xml:space="preserve">Domain Admins, Enterprise Admins, Schema Admins and six further privileged groups are reviewed. New members, stale accounts, service accounts, and nested groups are flagged. Members can be removed with per-member approval.</w:t>
+              <w:t>Domain Admins, Enterprise Admins, Schema Admins and six further privileged groups are reviewed. New members, stale accounts, service accounts, and nested groups are flagged. Members can be removed with per-member approval.</w:t>
             </w:r>
           </w:p>
         </w:tc>
@@ -943,12 +1184,16 @@
         <w:pStyle w:val="Heading1"/>
       </w:pPr>
       <w:r>
-        <w:t xml:space="preserve">Engagement Approach</w:t>
-      </w:r>
-    </w:p>
-    <w:p>
-      <w:r>
-        <w:t xml:space="preserve">We propose to structure the engagement in four sequential phases. Phases 1 and 2 can be run in parallel where the risk profile allows, and the DC upgrade (Phase 3) is sequenced to follow the initial remediation wave so that hardening work is not duplicated across OS versions.</w:t>
+        <w:t>Engagement Approach</w:t>
+      </w:r>
+    </w:p>
+    <w:p>
+      <w:r>
+        <w:t xml:space="preserve">We propose to structure the engagement in four sequential phases. Phases 1 and 2 can be run in parallel where the risk profile allows, and the DC upgrade (Phase 3) is </w:t>
+      </w:r>
+      <w:r>
+        <w:lastRenderedPageBreak/>
+        <w:t>sequenced to follow the initial remediation wave so that hardening work is not duplicated across OS versions.</w:t>
       </w:r>
     </w:p>
     <w:p>
@@ -956,12 +1201,12 @@
         <w:pStyle w:val="Heading2"/>
       </w:pPr>
       <w:r>
-        <w:t xml:space="preserve">Phase 1 -- Discovery and Assessment</w:t>
-      </w:r>
-    </w:p>
-    <w:p>
-      <w:r>
-        <w:t xml:space="preserve">Run the agent in Discover mode across all milestones to establish a current-state findings report. Fusion5 will review the output with MetLife's AD team, prioritise findings by risk severity, and agree a remediation sequence. This phase makes no changes to Active Directory and can begin promptly upon engagement confirmation. Typical output includes a ranked findings list, a CIS compliance gap summary, and a recommended remediation roadmap.</w:t>
+        <w:t>Phase 1 -- Discovery and Assessment</w:t>
+      </w:r>
+    </w:p>
+    <w:p>
+      <w:r>
+        <w:t>Run the agent in Discover mode across all milestones to establish a current-state findings report. Fusion5 will review the output with MetLife's AD team, prioritise findings by risk severity, and agree a remediation sequence. This phase makes no changes to Active Directory and can begin promptly upon engagement confirmation. Typical output includes a ranked findings list, a CIS compliance gap summary, and a recommended remediation roadmap.</w:t>
       </w:r>
     </w:p>
     <w:p>
@@ -969,12 +1214,12 @@
         <w:pStyle w:val="Heading2"/>
       </w:pPr>
       <w:r>
-        <w:t xml:space="preserve">Phase 2 -- Remediation</w:t>
-      </w:r>
-    </w:p>
-    <w:p>
-      <w:r>
-        <w:t xml:space="preserve">Work through the agreed milestones in Remediate mode. Each finding is presented to the operator with the exact proposed action, impact if applied incorrectly, and step-by-step rollback instructions before any approval prompt is shown. We recommend prioritising in risk order: unconstrained delegation (M4), delegated permissions (M10), DC hardening (M7), privileged group review (M12), and Kerberos configuration (M6) before addressing hygiene items such as stale accounts, GPO cleanup, and security group cleanup.</w:t>
+        <w:t>Phase 2 -- Remediation</w:t>
+      </w:r>
+    </w:p>
+    <w:p>
+      <w:r>
+        <w:t>Work through the agreed milestones in Remediate mode. Each finding is presented to the operator with the exact proposed action, impact if applied incorrectly, and step-by-step rollback instructions before any approval prompt is shown. We recommend prioritising in risk order: unconstrained delegation (M4), delegated permissions (M10), DC hardening (M7), privileged group review (M12), and Kerberos configuration (M6) before addressing hygiene items such as stale accounts, GPO cleanup, and security group cleanup.</w:t>
       </w:r>
     </w:p>
     <w:p>
@@ -982,12 +1227,12 @@
         <w:pStyle w:val="Heading2"/>
       </w:pPr>
       <w:r>
-        <w:t xml:space="preserve">Phase 3 -- Domain Controller Upgrade to Windows Server 2025</w:t>
-      </w:r>
-    </w:p>
-    <w:p>
-      <w:r>
-        <w:t xml:space="preserve">Following the initial remediation wave, Fusion5 will lead the Domain Controller upgrade to Windows Server 2025. We recommend a swing migration approach to preserve DC IP addresses and avoid disruption to any applications with IP-bound dependencies on DC addresses. The M1 health and readiness report produced in Phase 1 will be used to sequence the upgrade and validate each DC post-migration. DFSR SYSVOL replication mode will be confirmed prior to commencing the upgrade.</w:t>
+        <w:t>Phase 3 -- Domain Controller Upgrade to Windows Server 2025</w:t>
+      </w:r>
+    </w:p>
+    <w:p>
+      <w:r>
+        <w:t>Following the initial remediation wave, Fusion5 will lead the Domain Controller upgrade to Windows Server 2025. We recommend a swing migration approach to preserve DC IP addresses and avoid disruption to any applications with IP-bound dependencies on DC addresses. The M1 health and readiness report produced in Phase 1 will be used to sequence the upgrade and validate each DC post-migration. DFSR SYSVOL replication mode will be confirmed prior to commencing the upgrade.</w:t>
       </w:r>
     </w:p>
     <w:p>
@@ -995,12 +1240,12 @@
         <w:pStyle w:val="Heading2"/>
       </w:pPr>
       <w:r>
-        <w:t xml:space="preserve">Phase 4 -- Post-Upgrade Baseline and Ongoing Monitoring</w:t>
-      </w:r>
-    </w:p>
-    <w:p>
-      <w:r>
-        <w:t xml:space="preserve">Once all DCs are confirmed on Windows Server 2025, the agent will snapshot the post-upgrade, post-remediation state as the approved baseline. Fusion5 recommends scheduling regular Discover runs to maintain ongoing visibility of AD configuration drift. This positions the tooling as a sustainable monitoring capability that MetLife can continue to operate after the initial engagement concludes.</w:t>
+        <w:t>Phase 4 -- Post-Upgrade Baseline and Ongoing Monitoring</w:t>
+      </w:r>
+    </w:p>
+    <w:p>
+      <w:r>
+        <w:t>Once all DCs are confirmed on Windows Server 2025, the agent will snapshot the post-upgrade, post-remediation state as the approved baseline. Fusion5 recommends scheduling regular Discover runs to maintain ongoing visibility of AD configuration drift. This positions the tooling as a sustainable monitoring capability that MetLife can continue to operate after the initial engagement concludes.</w:t>
       </w:r>
     </w:p>
     <w:p>
@@ -1008,12 +1253,13 @@
         <w:pStyle w:val="Heading1"/>
       </w:pPr>
       <w:r>
-        <w:t xml:space="preserve">How We Will Keep Your Environment Safe</w:t>
-      </w:r>
-    </w:p>
-    <w:p>
-      <w:r>
-        <w:t xml:space="preserve">We understand that this work will be performed in a production Active Directory environment. Our approach is designed from the ground up to be safe, reversible, and fully under MetLife's control at every step.</w:t>
+        <w:lastRenderedPageBreak/>
+        <w:t>How We Will Keep Your Environment Safe</w:t>
+      </w:r>
+    </w:p>
+    <w:p>
+      <w:r>
+        <w:t>We understand that this work will be performed in a production Active Directory environment. Our approach is designed from the ground up to be safe, reversible, and fully under MetLife's control at every step.</w:t>
       </w:r>
     </w:p>
     <w:p>
@@ -1021,12 +1267,12 @@
         <w:pStyle w:val="Heading2"/>
       </w:pPr>
       <w:r>
-        <w:t xml:space="preserve">Explicit approval before every change</w:t>
-      </w:r>
-    </w:p>
-    <w:p>
-      <w:r>
-        <w:t xml:space="preserve">No change will be made to Active Directory without the operator reviewing and approving it at the command line. For every remediable finding, the operator is shown the exact action proposed, the potential impact if applied incorrectly, and rollback steps before any prompt is presented. For HIGH and CRITICAL risk changes -- such as removing delegation rights or modifying DC-level ACLs -- the operator must type the name of the target object exactly before the approval prompt appears.</w:t>
+        <w:t>Explicit approval before every change</w:t>
+      </w:r>
+    </w:p>
+    <w:p>
+      <w:r>
+        <w:t>No change will be made to Active Directory without the operator reviewing and approving it at the command line. For every remediable finding, the operator is shown the exact action proposed, the potential impact if applied incorrectly, and rollback steps before any prompt is presented. For HIGH and CRITICAL risk changes -- such as removing delegation rights or modifying DC-level ACLs -- the operator must type the name of the target object exactly before the approval prompt appears.</w:t>
       </w:r>
     </w:p>
     <w:p>
@@ -1034,12 +1280,12 @@
         <w:pStyle w:val="Heading2"/>
       </w:pPr>
       <w:r>
-        <w:t xml:space="preserve">No accounts or objects will be deleted</w:t>
-      </w:r>
-    </w:p>
-    <w:p>
-      <w:r>
-        <w:t xml:space="preserve">Stale user and computer accounts are quarantined -- disabled and moved to a dedicated Quarantine OU with a date-stamped description -- never deleted. Group Policy Objects are backed up and disabled before any deletion is offered, with a distinct second approval step required. AD objects can be recovered at any time from the Quarantine OU or from GPO backups.</w:t>
+        <w:t>No accounts or objects will be deleted</w:t>
+      </w:r>
+    </w:p>
+    <w:p>
+      <w:r>
+        <w:t>Stale user and computer accounts are quarantined -- disabled and moved to a dedicated Quarantine OU with a date-stamped description -- never deleted. Group Policy Objects are backed up and disabled before any deletion is offered, with a distinct second approval step required. AD objects can be recovered at any time from the Quarantine OU or from GPO backups.</w:t>
       </w:r>
     </w:p>
     <w:p>
@@ -1047,12 +1293,12 @@
         <w:pStyle w:val="Heading2"/>
       </w:pPr>
       <w:r>
-        <w:t xml:space="preserve">Full audit trail of all actions</w:t>
-      </w:r>
-    </w:p>
-    <w:p>
-      <w:r>
-        <w:t xml:space="preserve">Every run produces a structured CSV activity log and an HTML report recording the timestamp, finding, target object, operator decision, and outcome for every item processed. These logs are suitable for direct submission as audit evidence and are retained in a configurable output directory.</w:t>
+        <w:t>Full audit trail of all actions</w:t>
+      </w:r>
+    </w:p>
+    <w:p>
+      <w:r>
+        <w:t>Every run produces a structured CSV activity log and an HTML report recording the timestamp, finding, target object, operator decision, and outcome for every item processed. These logs are suitable for direct submission as audit evidence and are retained in a configurable output directory.</w:t>
       </w:r>
     </w:p>
     <w:p>
@@ -1060,12 +1306,12 @@
         <w:pStyle w:val="Heading2"/>
       </w:pPr>
       <w:r>
-        <w:t xml:space="preserve">Baseline comparison and drift tracking</w:t>
-      </w:r>
-    </w:p>
-    <w:p>
-      <w:r>
-        <w:t xml:space="preserve">After the post-upgrade baseline is set, all subsequent runs will clearly distinguish findings that are New, Persisting, or Resolved -- providing a clear record of remediation progress and any configuration drift that occurs after the initial cleanup.</w:t>
+        <w:t>Baseline comparison and drift tracking</w:t>
+      </w:r>
+    </w:p>
+    <w:p>
+      <w:r>
+        <w:t>After the post-upgrade baseline is set, all subsequent runs will clearly distinguish findings that are New, Persisting, or Resolved -- providing a clear record of remediation progress and any configuration drift that occurs after the initial cleanup.</w:t>
       </w:r>
     </w:p>
     <w:p>
@@ -1073,7 +1319,8 @@
         <w:pStyle w:val="Heading1"/>
       </w:pPr>
       <w:r>
-        <w:t xml:space="preserve">Why Fusion5</w:t>
+        <w:lastRenderedPageBreak/>
+        <w:t>Why Fusion5</w:t>
       </w:r>
     </w:p>
     <w:p>
@@ -1081,12 +1328,12 @@
         <w:pStyle w:val="Heading2"/>
       </w:pPr>
       <w:r>
-        <w:t xml:space="preserve">Purpose-built for your environment</w:t>
-      </w:r>
-    </w:p>
-    <w:p>
-      <w:r>
-        <w:t xml:space="preserve">Rather than adapting a generic scanning tool, Fusion5 will develop a framework built specifically around MetLife's stated requirements and environment -- including the Hybrid Azure AD Join configuration, Windows Hello for Business Kerberos hybrid trust objects, and IP-bound application dependencies on DC addresses. Every finding and every remediation step will be directly applicable to MetLife, not generic.</w:t>
+        <w:t>Purpose-built for your environment</w:t>
+      </w:r>
+    </w:p>
+    <w:p>
+      <w:r>
+        <w:t>Rather than adapting a generic scanning tool, Fusion5 will develop a framework built specifically around MetLife's stated requirements and environment -- including the Hybrid Azure AD Join configuration, Windows Hello for Business Kerberos hybrid trust objects, and IP-bound application dependencies on DC addresses. Every finding and every remediation step will be directly applicable to MetLife, not generic.</w:t>
       </w:r>
     </w:p>
     <w:p>
@@ -1094,12 +1341,12 @@
         <w:pStyle w:val="Heading2"/>
       </w:pPr>
       <w:r>
-        <w:t xml:space="preserve">Practical remediation focus</w:t>
-      </w:r>
-    </w:p>
-    <w:p>
-      <w:r>
-        <w:t xml:space="preserve">Our approach aligns with your stated intent: focused, practical remediation and cleanup. The engagement is not an audit that produces a report and walks away -- we will work alongside MetLife's AD team through each remediation step, with Fusion5 consultants present during any Remediate mode sessions.</w:t>
+        <w:t>Practical remediation focus</w:t>
+      </w:r>
+    </w:p>
+    <w:p>
+      <w:r>
+        <w:t>Our approach aligns with your stated intent: focused, practical remediation and cleanup. The engagement is not an audit that produces a report and walks away -- we will work alongside MetLife's AD team through each remediation step, with Fusion5 consultants present during any Remediate mode sessions.</w:t>
       </w:r>
     </w:p>
     <w:p>
@@ -1107,12 +1354,20 @@
         <w:pStyle w:val="Heading2"/>
       </w:pPr>
       <w:r>
-        <w:t xml:space="preserve">Compliance-ready output</w:t>
-      </w:r>
-    </w:p>
-    <w:p>
-      <w:r>
-        <w:t xml:space="preserve">Every finding maps to a CIS Benchmark Level 1 control and a NIST SP 800-53 identifier. The HTML reports are structured for direct use in audit evidence packages, reducing the overhead of translating technical remediation work into governance documentation.</w:t>
+        <w:t>Compliance-ready output</w:t>
+      </w:r>
+    </w:p>
+    <w:p>
+      <w:r>
+        <w:t xml:space="preserve">Every finding </w:t>
+      </w:r>
+      <w:proofErr w:type="gramStart"/>
+      <w:r>
+        <w:t>maps</w:t>
+      </w:r>
+      <w:proofErr w:type="gramEnd"/>
+      <w:r>
+        <w:t xml:space="preserve"> to a CIS Benchmark Level 1 control and a NIST SP 800-53 identifier. The HTML reports are structured for direct use in audit evidence packages, reducing the overhead of translating technical remediation work into governance documentation.</w:t>
       </w:r>
     </w:p>
     <w:p>
@@ -1120,12 +1375,12 @@
         <w:pStyle w:val="Heading2"/>
       </w:pPr>
       <w:r>
-        <w:t xml:space="preserve">Knowledge transfer and ongoing capability</w:t>
-      </w:r>
-    </w:p>
-    <w:p>
-      <w:r>
-        <w:t xml:space="preserve">The AD Remediation Agent and all tooling will be handed over to MetLife at the conclusion of the engagement. Your AD team will be able to continue running Discover and Report modes independently on an ongoing basis, with Fusion5 available for support, follow-on remediation sessions, or additional module development as your requirements evolve.</w:t>
+        <w:t>Knowledge transfer and ongoing capability</w:t>
+      </w:r>
+    </w:p>
+    <w:p>
+      <w:r>
+        <w:t>The AD Remediation Agent and all tooling will be handed over to MetLife at the conclusion of the engagement. Your AD team will be able to continue running Discover and Report modes independently on an ongoing basis, with Fusion5 available for support, follow-on remediation sessions, or additional module development as your requirements evolve.</w:t>
       </w:r>
     </w:p>
     <w:p>
@@ -1133,12 +1388,12 @@
         <w:pStyle w:val="Heading1"/>
       </w:pPr>
       <w:r>
-        <w:t xml:space="preserve">Proposed Next Steps</w:t>
-      </w:r>
-    </w:p>
-    <w:p>
-      <w:r>
-        <w:t xml:space="preserve">Following our initial discussion, we are ready to move forward as soon as scope and timelines are confirmed. The following steps are proposed:</w:t>
+        <w:t>Proposed Next Steps</w:t>
+      </w:r>
+    </w:p>
+    <w:p>
+      <w:r>
+        <w:t>Following our initial discussion, we are ready to move forward as soon as scope and timelines are confirmed. The following steps are proposed:</w:t>
       </w:r>
     </w:p>
     <w:p>
@@ -1146,7 +1401,7 @@
         <w:pStyle w:val="ListNumber"/>
       </w:pPr>
       <w:r>
-        <w:t xml:space="preserve">MetLife to review this proposal and confirm the scope, phasing, and any adjustments arising from our initial discussion</w:t>
+        <w:t>MetLife to review this proposal and confirm the scope, phasing, and any adjustments arising from our initial discussion</w:t>
       </w:r>
     </w:p>
     <w:p>
@@ -1154,7 +1409,7 @@
         <w:pStyle w:val="ListNumber"/>
       </w:pPr>
       <w:r>
-        <w:t xml:space="preserve">Fusion5 to prepare and issue a Statement of Work based on the confirmed scope</w:t>
+        <w:t>Fusion5 to prepare and issue a Statement of Work based on the confirmed scope</w:t>
       </w:r>
     </w:p>
     <w:p>
@@ -1162,7 +1417,8 @@
         <w:pStyle w:val="ListNumber"/>
       </w:pPr>
       <w:r>
-        <w:t xml:space="preserve">MetLife to confirm access arrangements -- a domain-joined machine and a read-privileged account are sufficient to begin Phase 1 in Discover mode with no changes to Active Directory</w:t>
+        <w:lastRenderedPageBreak/>
+        <w:t>MetLife to confirm access arrangements -- a domain-joined machine and a read-privileged account are sufficient to begin Phase 1 in Discover mode with no changes to Active Directory</w:t>
       </w:r>
     </w:p>
     <w:p>
@@ -1170,7 +1426,7 @@
         <w:pStyle w:val="ListNumber"/>
       </w:pPr>
       <w:r>
-        <w:t xml:space="preserve">Agree a start date and milestone sequencing aligned to MetLife's DC upgrade timeline</w:t>
+        <w:t>Agree a start date and milestone sequencing aligned to MetLife's DC upgrade timeline</w:t>
       </w:r>
     </w:p>
     <w:p>
@@ -1178,30 +1434,34 @@
         <w:pStyle w:val="ListNumber"/>
       </w:pPr>
       <w:r>
-        <w:t xml:space="preserve">Commence Phase 1 -- Discovery and Assessment</w:t>
+        <w:t>Commence Phase 1 -- Discovery and Assessment</w:t>
       </w:r>
     </w:p>
     <w:p/>
     <w:p>
       <w:r>
-        <w:t xml:space="preserve">We look forward to your feedback on this proposal. Please do not hesitate to reach out if you have any questions or would like to discuss any aspect of the proposed approach.</w:t>
+        <w:t>We look forward to your feedback on this proposal. Please do not hesitate to reach out if you have any questions or would like to discuss any aspect of the proposed approach.</w:t>
       </w:r>
     </w:p>
     <w:sectPr>
       <w:pgSz w:w="12240" w:h="15840"/>
-      <w:pgMar w:top="1440" w:right="1800" w:bottom="1440" w:left="1800"/>
+      <w:pgMar w:top="1440" w:right="1800" w:bottom="1440" w:left="1800" w:header="720" w:footer="720" w:gutter="0"/>
+      <w:cols w:space="720"/>
     </w:sectPr>
   </w:body>
 </w:document>
 </file>
 
 <file path=word/numbering.xml><?xml version="1.0" encoding="utf-8"?>
-<w:numbering xmlns:w="http://schemas.openxmlformats.org/wordprocessingml/2006/main">
-  <w:abstractNum w:abstractNumId="0">
+<w:numbering xmlns:wpc="http://schemas.microsoft.com/office/word/2010/wordprocessingCanvas" xmlns:cx="http://schemas.microsoft.com/office/drawing/2014/chartex" xmlns:cx1="http://schemas.microsoft.com/office/drawing/2015/9/8/chartex" xmlns:cx2="http://schemas.microsoft.com/office/drawing/2015/10/21/chartex" xmlns:cx3="http://schemas.microsoft.com/office/drawing/2016/5/9/chartex" xmlns:cx4="http://schemas.microsoft.com/office/drawing/2016/5/10/chartex" xmlns:cx5="http://schemas.microsoft.com/office/drawing/2016/5/11/chartex" xmlns:cx6="http://schemas.microsoft.com/office/drawing/2016/5/12/chartex" xmlns:cx7="http://schemas.microsoft.com/office/drawing/2016/5/13/chartex" xmlns:cx8="http://schemas.microsoft.com/office/drawing/2016/5/14/chartex" xmlns:mc="http://schemas.openxmlformats.org/markup-compatibility/2006" xmlns:aink="http://schemas.microsoft.com/office/drawing/2016/ink" xmlns:am3d="http://schemas.microsoft.com/office/drawing/2017/model3d" xmlns:o="urn:schemas-microsoft-com:office:office" xmlns:oel="http://schemas.microsoft.com/office/2019/extlst" xmlns:r="http://schemas.openxmlformats.org/officeDocument/2006/relationships" xmlns:m="http://schemas.openxmlformats.org/officeDocument/2006/math" xmlns:v="urn:schemas-microsoft-com:vml" xmlns:wp14="http://schemas.microsoft.com/office/word/2010/wordprocessingDrawing" xmlns:wp="http://schemas.openxmlformats.org/drawingml/2006/wordprocessingDrawing" xmlns:w10="urn:schemas-microsoft-com:office:word" xmlns:w="http://schemas.openxmlformats.org/wordprocessingml/2006/main" xmlns:w14="http://schemas.microsoft.com/office/word/2010/wordml" xmlns:w15="http://schemas.microsoft.com/office/word/2012/wordml" xmlns:w16cex="http://schemas.microsoft.com/office/word/2018/wordml/cex" xmlns:w16cid="http://schemas.microsoft.com/office/word/2016/wordml/cid" xmlns:w16="http://schemas.microsoft.com/office/word/2018/wordml" xmlns:w16du="http://schemas.microsoft.com/office/word/2023/wordml/word16du" xmlns:w16sdtdh="http://schemas.microsoft.com/office/word/2020/wordml/sdtdatahash" xmlns:w16sdtfl="http://schemas.microsoft.com/office/word/2024/wordml/sdtformatlock" xmlns:w16se="http://schemas.microsoft.com/office/word/2015/wordml/symex" xmlns:wpg="http://schemas.microsoft.com/office/word/2010/wordprocessingGroup" xmlns:wpi="http://schemas.microsoft.com/office/word/2010/wordprocessingInk" xmlns:wne="http://schemas.microsoft.com/office/word/2006/wordml" xmlns:wps="http://schemas.microsoft.com/office/word/2010/wordprocessingShape" mc:Ignorable="w14 w15 w16se w16cid w16 w16cex w16sdtdh w16sdtfl w16du wp14">
+  <w:abstractNum w:abstractNumId="0" w15:restartNumberingAfterBreak="0">
+    <w:nsid w:val="418C6C8F"/>
     <w:multiLevelType w:val="hybridMultilevel"/>
-    <w:lvl w:ilvl="0">
+    <w:tmpl w:val="D696C6E6"/>
+    <w:lvl w:ilvl="0" w:tplc="DA8CC4A2">
       <w:start w:val="1"/>
       <w:numFmt w:val="bullet"/>
+      <w:pStyle w:val="ListBullet"/>
       <w:lvlText w:val="•"/>
       <w:lvlJc w:val="left"/>
       <w:pPr>
@@ -1211,7 +1471,7 @@
         <w:sz w:val="24"/>
       </w:rPr>
     </w:lvl>
-    <w:lvl w:ilvl="1">
+    <w:lvl w:ilvl="1" w:tplc="2FCAB434">
       <w:start w:val="1"/>
       <w:numFmt w:val="bullet"/>
       <w:lvlText w:val="◦"/>
@@ -1220,148 +1480,635 @@
         <w:ind w:left="1440" w:hanging="360"/>
       </w:pPr>
     </w:lvl>
+    <w:lvl w:ilvl="2" w:tplc="C360BD66">
+      <w:numFmt w:val="decimal"/>
+      <w:lvlText w:val=""/>
+      <w:lvlJc w:val="left"/>
+    </w:lvl>
+    <w:lvl w:ilvl="3" w:tplc="6B088ABC">
+      <w:numFmt w:val="decimal"/>
+      <w:lvlText w:val=""/>
+      <w:lvlJc w:val="left"/>
+    </w:lvl>
+    <w:lvl w:ilvl="4" w:tplc="D8280324">
+      <w:numFmt w:val="decimal"/>
+      <w:lvlText w:val=""/>
+      <w:lvlJc w:val="left"/>
+    </w:lvl>
+    <w:lvl w:ilvl="5" w:tplc="DA244B34">
+      <w:numFmt w:val="decimal"/>
+      <w:lvlText w:val=""/>
+      <w:lvlJc w:val="left"/>
+    </w:lvl>
+    <w:lvl w:ilvl="6" w:tplc="57EA18E8">
+      <w:numFmt w:val="decimal"/>
+      <w:lvlText w:val=""/>
+      <w:lvlJc w:val="left"/>
+    </w:lvl>
+    <w:lvl w:ilvl="7" w:tplc="F614E682">
+      <w:numFmt w:val="decimal"/>
+      <w:lvlText w:val=""/>
+      <w:lvlJc w:val="left"/>
+    </w:lvl>
+    <w:lvl w:ilvl="8" w:tplc="9EB05FCE">
+      <w:numFmt w:val="decimal"/>
+      <w:lvlText w:val=""/>
+      <w:lvlJc w:val="left"/>
+    </w:lvl>
   </w:abstractNum>
-  <w:abstractNum w:abstractNumId="1">
+  <w:abstractNum w:abstractNumId="1" w15:restartNumberingAfterBreak="0">
+    <w:nsid w:val="56FC512E"/>
     <w:multiLevelType w:val="hybridMultilevel"/>
-    <w:lvl w:ilvl="0">
+    <w:tmpl w:val="1214C678"/>
+    <w:lvl w:ilvl="0" w:tplc="90B0472E">
       <w:start w:val="1"/>
       <w:numFmt w:val="decimal"/>
+      <w:pStyle w:val="ListNumber"/>
       <w:lvlText w:val="%1."/>
       <w:lvlJc w:val="left"/>
       <w:pPr>
         <w:ind w:left="720" w:hanging="360"/>
       </w:pPr>
     </w:lvl>
+    <w:lvl w:ilvl="1" w:tplc="14682FA2">
+      <w:numFmt w:val="decimal"/>
+      <w:lvlText w:val=""/>
+      <w:lvlJc w:val="left"/>
+    </w:lvl>
+    <w:lvl w:ilvl="2" w:tplc="E176EB8E">
+      <w:numFmt w:val="decimal"/>
+      <w:lvlText w:val=""/>
+      <w:lvlJc w:val="left"/>
+    </w:lvl>
+    <w:lvl w:ilvl="3" w:tplc="47F6FF0C">
+      <w:numFmt w:val="decimal"/>
+      <w:lvlText w:val=""/>
+      <w:lvlJc w:val="left"/>
+    </w:lvl>
+    <w:lvl w:ilvl="4" w:tplc="2AD69A1C">
+      <w:numFmt w:val="decimal"/>
+      <w:lvlText w:val=""/>
+      <w:lvlJc w:val="left"/>
+    </w:lvl>
+    <w:lvl w:ilvl="5" w:tplc="8E78345A">
+      <w:numFmt w:val="decimal"/>
+      <w:lvlText w:val=""/>
+      <w:lvlJc w:val="left"/>
+    </w:lvl>
+    <w:lvl w:ilvl="6" w:tplc="DD48A046">
+      <w:numFmt w:val="decimal"/>
+      <w:lvlText w:val=""/>
+      <w:lvlJc w:val="left"/>
+    </w:lvl>
+    <w:lvl w:ilvl="7" w:tplc="4E520CC0">
+      <w:numFmt w:val="decimal"/>
+      <w:lvlText w:val=""/>
+      <w:lvlJc w:val="left"/>
+    </w:lvl>
+    <w:lvl w:ilvl="8" w:tplc="77545B48">
+      <w:numFmt w:val="decimal"/>
+      <w:lvlText w:val=""/>
+      <w:lvlJc w:val="left"/>
+    </w:lvl>
   </w:abstractNum>
-  <w:num w:numId="1">
+  <w:num w:numId="1" w16cid:durableId="393895017">
     <w:abstractNumId w:val="0"/>
   </w:num>
-  <w:num w:numId="2">
+  <w:num w:numId="2" w16cid:durableId="1637367356">
     <w:abstractNumId w:val="1"/>
   </w:num>
 </w:numbering>
 </file>
 
 <file path=word/styles.xml><?xml version="1.0" encoding="utf-8"?>
-<w:styles xmlns:w="http://schemas.openxmlformats.org/wordprocessingml/2006/main">
+<w:styles xmlns:mc="http://schemas.openxmlformats.org/markup-compatibility/2006" xmlns:r="http://schemas.openxmlformats.org/officeDocument/2006/relationships" xmlns:w="http://schemas.openxmlformats.org/wordprocessingml/2006/main" xmlns:w14="http://schemas.microsoft.com/office/word/2010/wordml" xmlns:w15="http://schemas.microsoft.com/office/word/2012/wordml" xmlns:w16cex="http://schemas.microsoft.com/office/word/2018/wordml/cex" xmlns:w16cid="http://schemas.microsoft.com/office/word/2016/wordml/cid" xmlns:w16="http://schemas.microsoft.com/office/word/2018/wordml" xmlns:w16du="http://schemas.microsoft.com/office/word/2023/wordml/word16du" xmlns:w16sdtdh="http://schemas.microsoft.com/office/word/2020/wordml/sdtdatahash" xmlns:w16sdtfl="http://schemas.microsoft.com/office/word/2024/wordml/sdtformatlock" xmlns:w16se="http://schemas.microsoft.com/office/word/2015/wordml/symex" mc:Ignorable="w14 w15 w16se w16cid w16 w16cex w16sdtdh w16sdtfl w16du">
   <w:docDefaults>
     <w:rPrDefault>
       <w:rPr>
-        <w:rFonts w:ascii="Calibri" w:hAnsi="Calibri"/>
+        <w:rFonts w:ascii="Calibri" w:eastAsia="Times New Roman" w:hAnsi="Calibri" w:cs="Times New Roman"/>
         <w:sz w:val="24"/>
         <w:szCs w:val="24"/>
+        <w:lang w:val="en-AU" w:eastAsia="en-AU" w:bidi="ar-SA"/>
       </w:rPr>
     </w:rPrDefault>
+    <w:pPrDefault>
+      <w:pPr>
+        <w:spacing w:after="160" w:line="278" w:lineRule="auto"/>
+      </w:pPr>
+    </w:pPrDefault>
   </w:docDefaults>
-  <w:style w:type="paragraph" w:styleId="Normal" w:default="1">
+  <w:latentStyles w:defLockedState="0" w:defUIPriority="99" w:defSemiHidden="0" w:defUnhideWhenUsed="0" w:defQFormat="0" w:count="376">
+    <w:lsdException w:name="Normal" w:uiPriority="0" w:qFormat="1"/>
+    <w:lsdException w:name="heading 1" w:uiPriority="9" w:qFormat="1"/>
+    <w:lsdException w:name="heading 2" w:semiHidden="1" w:uiPriority="9" w:unhideWhenUsed="1" w:qFormat="1"/>
+    <w:lsdException w:name="heading 3" w:semiHidden="1" w:uiPriority="9" w:unhideWhenUsed="1" w:qFormat="1"/>
+    <w:lsdException w:name="heading 4" w:semiHidden="1" w:uiPriority="9" w:unhideWhenUsed="1" w:qFormat="1"/>
+    <w:lsdException w:name="heading 5" w:semiHidden="1" w:uiPriority="9" w:unhideWhenUsed="1" w:qFormat="1"/>
+    <w:lsdException w:name="heading 6" w:semiHidden="1" w:uiPriority="9" w:unhideWhenUsed="1" w:qFormat="1"/>
+    <w:lsdException w:name="heading 7" w:semiHidden="1" w:uiPriority="9" w:unhideWhenUsed="1" w:qFormat="1"/>
+    <w:lsdException w:name="heading 8" w:semiHidden="1" w:uiPriority="9" w:unhideWhenUsed="1" w:qFormat="1"/>
+    <w:lsdException w:name="heading 9" w:semiHidden="1" w:uiPriority="9" w:unhideWhenUsed="1" w:qFormat="1"/>
+    <w:lsdException w:name="index 1" w:semiHidden="1" w:unhideWhenUsed="1"/>
+    <w:lsdException w:name="index 2" w:semiHidden="1" w:unhideWhenUsed="1"/>
+    <w:lsdException w:name="index 3" w:semiHidden="1" w:unhideWhenUsed="1"/>
+    <w:lsdException w:name="index 4" w:semiHidden="1" w:unhideWhenUsed="1"/>
+    <w:lsdException w:name="index 5" w:semiHidden="1" w:unhideWhenUsed="1"/>
+    <w:lsdException w:name="index 6" w:semiHidden="1" w:unhideWhenUsed="1"/>
+    <w:lsdException w:name="index 7" w:semiHidden="1" w:unhideWhenUsed="1"/>
+    <w:lsdException w:name="index 8" w:semiHidden="1" w:unhideWhenUsed="1"/>
+    <w:lsdException w:name="index 9" w:semiHidden="1" w:unhideWhenUsed="1"/>
+    <w:lsdException w:name="toc 1" w:semiHidden="1" w:uiPriority="39" w:unhideWhenUsed="1"/>
+    <w:lsdException w:name="toc 2" w:semiHidden="1" w:uiPriority="39" w:unhideWhenUsed="1"/>
+    <w:lsdException w:name="toc 3" w:semiHidden="1" w:uiPriority="39" w:unhideWhenUsed="1"/>
+    <w:lsdException w:name="toc 4" w:semiHidden="1" w:uiPriority="39" w:unhideWhenUsed="1"/>
+    <w:lsdException w:name="toc 5" w:semiHidden="1" w:uiPriority="39" w:unhideWhenUsed="1"/>
+    <w:lsdException w:name="toc 6" w:semiHidden="1" w:uiPriority="39" w:unhideWhenUsed="1"/>
+    <w:lsdException w:name="toc 7" w:semiHidden="1" w:uiPriority="39" w:unhideWhenUsed="1"/>
+    <w:lsdException w:name="toc 8" w:semiHidden="1" w:uiPriority="39" w:unhideWhenUsed="1"/>
+    <w:lsdException w:name="toc 9" w:semiHidden="1" w:uiPriority="39" w:unhideWhenUsed="1"/>
+    <w:lsdException w:name="Normal Indent" w:semiHidden="1" w:unhideWhenUsed="1"/>
+    <w:lsdException w:name="footnote text" w:semiHidden="1" w:unhideWhenUsed="1"/>
+    <w:lsdException w:name="annotation text" w:semiHidden="1" w:unhideWhenUsed="1"/>
+    <w:lsdException w:name="header" w:semiHidden="1" w:unhideWhenUsed="1"/>
+    <w:lsdException w:name="footer" w:semiHidden="1" w:unhideWhenUsed="1"/>
+    <w:lsdException w:name="index heading" w:semiHidden="1" w:unhideWhenUsed="1"/>
+    <w:lsdException w:name="caption" w:semiHidden="1" w:uiPriority="35" w:unhideWhenUsed="1" w:qFormat="1"/>
+    <w:lsdException w:name="table of figures" w:semiHidden="1" w:unhideWhenUsed="1"/>
+    <w:lsdException w:name="envelope address" w:semiHidden="1" w:unhideWhenUsed="1"/>
+    <w:lsdException w:name="envelope return" w:semiHidden="1" w:unhideWhenUsed="1"/>
+    <w:lsdException w:name="footnote reference" w:semiHidden="1" w:unhideWhenUsed="1"/>
+    <w:lsdException w:name="annotation reference" w:semiHidden="1" w:unhideWhenUsed="1"/>
+    <w:lsdException w:name="line number" w:semiHidden="1" w:unhideWhenUsed="1"/>
+    <w:lsdException w:name="page number" w:semiHidden="1" w:unhideWhenUsed="1"/>
+    <w:lsdException w:name="endnote reference" w:semiHidden="1" w:unhideWhenUsed="1"/>
+    <w:lsdException w:name="endnote text" w:semiHidden="1" w:unhideWhenUsed="1"/>
+    <w:lsdException w:name="table of authorities" w:semiHidden="1" w:unhideWhenUsed="1"/>
+    <w:lsdException w:name="macro" w:semiHidden="1" w:unhideWhenUsed="1"/>
+    <w:lsdException w:name="toa heading" w:semiHidden="1" w:unhideWhenUsed="1"/>
+    <w:lsdException w:name="List" w:semiHidden="1" w:unhideWhenUsed="1"/>
+    <w:lsdException w:name="List Bullet" w:semiHidden="1" w:unhideWhenUsed="1"/>
+    <w:lsdException w:name="List Number" w:semiHidden="1" w:unhideWhenUsed="1"/>
+    <w:lsdException w:name="List 2" w:semiHidden="1" w:unhideWhenUsed="1"/>
+    <w:lsdException w:name="List 3" w:semiHidden="1" w:unhideWhenUsed="1"/>
+    <w:lsdException w:name="List 4" w:semiHidden="1" w:unhideWhenUsed="1"/>
+    <w:lsdException w:name="List 5" w:semiHidden="1" w:unhideWhenUsed="1"/>
+    <w:lsdException w:name="List Bullet 2" w:semiHidden="1" w:unhideWhenUsed="1"/>
+    <w:lsdException w:name="List Bullet 3" w:semiHidden="1" w:unhideWhenUsed="1"/>
+    <w:lsdException w:name="List Bullet 4" w:semiHidden="1" w:unhideWhenUsed="1"/>
+    <w:lsdException w:name="List Bullet 5" w:semiHidden="1" w:unhideWhenUsed="1"/>
+    <w:lsdException w:name="List Number 2" w:semiHidden="1" w:unhideWhenUsed="1"/>
+    <w:lsdException w:name="List Number 3" w:semiHidden="1" w:unhideWhenUsed="1"/>
+    <w:lsdException w:name="List Number 4" w:semiHidden="1" w:unhideWhenUsed="1"/>
+    <w:lsdException w:name="List Number 5" w:semiHidden="1" w:unhideWhenUsed="1"/>
+    <w:lsdException w:name="Title" w:uiPriority="10" w:qFormat="1"/>
+    <w:lsdException w:name="Closing" w:semiHidden="1" w:unhideWhenUsed="1"/>
+    <w:lsdException w:name="Signature" w:semiHidden="1" w:unhideWhenUsed="1"/>
+    <w:lsdException w:name="Default Paragraph Font" w:semiHidden="1" w:uiPriority="1" w:unhideWhenUsed="1"/>
+    <w:lsdException w:name="Body Text" w:semiHidden="1" w:unhideWhenUsed="1"/>
+    <w:lsdException w:name="Body Text Indent" w:semiHidden="1" w:unhideWhenUsed="1"/>
+    <w:lsdException w:name="List Continue" w:semiHidden="1" w:unhideWhenUsed="1"/>
+    <w:lsdException w:name="List Continue 2" w:semiHidden="1" w:unhideWhenUsed="1"/>
+    <w:lsdException w:name="List Continue 3" w:semiHidden="1" w:unhideWhenUsed="1"/>
+    <w:lsdException w:name="List Continue 4" w:semiHidden="1" w:unhideWhenUsed="1"/>
+    <w:lsdException w:name="List Continue 5" w:semiHidden="1" w:unhideWhenUsed="1"/>
+    <w:lsdException w:name="Message Header" w:semiHidden="1" w:unhideWhenUsed="1"/>
+    <w:lsdException w:name="Subtitle" w:uiPriority="11" w:qFormat="1"/>
+    <w:lsdException w:name="Salutation" w:semiHidden="1" w:unhideWhenUsed="1"/>
+    <w:lsdException w:name="Date" w:semiHidden="1" w:unhideWhenUsed="1"/>
+    <w:lsdException w:name="Body Text First Indent" w:semiHidden="1" w:unhideWhenUsed="1"/>
+    <w:lsdException w:name="Body Text First Indent 2" w:semiHidden="1" w:unhideWhenUsed="1"/>
+    <w:lsdException w:name="Note Heading" w:semiHidden="1" w:unhideWhenUsed="1"/>
+    <w:lsdException w:name="Body Text 2" w:semiHidden="1" w:unhideWhenUsed="1"/>
+    <w:lsdException w:name="Body Text 3" w:semiHidden="1" w:unhideWhenUsed="1"/>
+    <w:lsdException w:name="Body Text Indent 2" w:semiHidden="1" w:unhideWhenUsed="1"/>
+    <w:lsdException w:name="Body Text Indent 3" w:semiHidden="1" w:unhideWhenUsed="1"/>
+    <w:lsdException w:name="Block Text" w:semiHidden="1" w:unhideWhenUsed="1"/>
+    <w:lsdException w:name="Hyperlink" w:semiHidden="1" w:unhideWhenUsed="1"/>
+    <w:lsdException w:name="FollowedHyperlink" w:semiHidden="1" w:unhideWhenUsed="1"/>
+    <w:lsdException w:name="Strong" w:uiPriority="22" w:qFormat="1"/>
+    <w:lsdException w:name="Emphasis" w:uiPriority="20" w:qFormat="1"/>
+    <w:lsdException w:name="Document Map" w:semiHidden="1" w:unhideWhenUsed="1"/>
+    <w:lsdException w:name="Plain Text" w:semiHidden="1" w:unhideWhenUsed="1"/>
+    <w:lsdException w:name="E-mail Signature" w:semiHidden="1" w:unhideWhenUsed="1"/>
+    <w:lsdException w:name="HTML Top of Form" w:semiHidden="1" w:unhideWhenUsed="1"/>
+    <w:lsdException w:name="HTML Bottom of Form" w:semiHidden="1" w:unhideWhenUsed="1"/>
+    <w:lsdException w:name="Normal (Web)" w:semiHidden="1" w:unhideWhenUsed="1"/>
+    <w:lsdException w:name="HTML Acronym" w:semiHidden="1" w:unhideWhenUsed="1"/>
+    <w:lsdException w:name="HTML Address" w:semiHidden="1" w:unhideWhenUsed="1"/>
+    <w:lsdException w:name="HTML Cite" w:semiHidden="1" w:unhideWhenUsed="1"/>
+    <w:lsdException w:name="HTML Code" w:semiHidden="1" w:unhideWhenUsed="1"/>
+    <w:lsdException w:name="HTML Definition" w:semiHidden="1" w:unhideWhenUsed="1"/>
+    <w:lsdException w:name="HTML Keyboard" w:semiHidden="1" w:unhideWhenUsed="1"/>
+    <w:lsdException w:name="HTML Preformatted" w:semiHidden="1" w:unhideWhenUsed="1"/>
+    <w:lsdException w:name="HTML Sample" w:semiHidden="1" w:unhideWhenUsed="1"/>
+    <w:lsdException w:name="HTML Typewriter" w:semiHidden="1" w:unhideWhenUsed="1"/>
+    <w:lsdException w:name="HTML Variable" w:semiHidden="1" w:unhideWhenUsed="1"/>
+    <w:lsdException w:name="Normal Table" w:semiHidden="1" w:unhideWhenUsed="1"/>
+    <w:lsdException w:name="annotation subject" w:semiHidden="1" w:unhideWhenUsed="1"/>
+    <w:lsdException w:name="No List" w:semiHidden="1" w:unhideWhenUsed="1"/>
+    <w:lsdException w:name="Outline List 1" w:semiHidden="1" w:unhideWhenUsed="1"/>
+    <w:lsdException w:name="Outline List 2" w:semiHidden="1" w:unhideWhenUsed="1"/>
+    <w:lsdException w:name="Outline List 3" w:semiHidden="1" w:unhideWhenUsed="1"/>
+    <w:lsdException w:name="Table Simple 1" w:semiHidden="1" w:unhideWhenUsed="1"/>
+    <w:lsdException w:name="Table Simple 2" w:semiHidden="1" w:unhideWhenUsed="1"/>
+    <w:lsdException w:name="Table Simple 3" w:semiHidden="1" w:unhideWhenUsed="1"/>
+    <w:lsdException w:name="Table Classic 1" w:semiHidden="1" w:unhideWhenUsed="1"/>
+    <w:lsdException w:name="Table Classic 2" w:semiHidden="1" w:unhideWhenUsed="1"/>
+    <w:lsdException w:name="Table Classic 3" w:semiHidden="1" w:unhideWhenUsed="1"/>
+    <w:lsdException w:name="Table Classic 4" w:semiHidden="1" w:unhideWhenUsed="1"/>
+    <w:lsdException w:name="Table Colorful 1" w:semiHidden="1" w:unhideWhenUsed="1"/>
+    <w:lsdException w:name="Table Colorful 2" w:semiHidden="1" w:unhideWhenUsed="1"/>
+    <w:lsdException w:name="Table Colorful 3" w:semiHidden="1" w:unhideWhenUsed="1"/>
+    <w:lsdException w:name="Table Columns 1" w:semiHidden="1" w:unhideWhenUsed="1"/>
+    <w:lsdException w:name="Table Columns 2" w:semiHidden="1" w:unhideWhenUsed="1"/>
+    <w:lsdException w:name="Table Columns 3" w:semiHidden="1" w:unhideWhenUsed="1"/>
+    <w:lsdException w:name="Table Columns 4" w:semiHidden="1" w:unhideWhenUsed="1"/>
+    <w:lsdException w:name="Table Columns 5" w:semiHidden="1" w:unhideWhenUsed="1"/>
+    <w:lsdException w:name="Table Grid 1" w:semiHidden="1" w:unhideWhenUsed="1"/>
+    <w:lsdException w:name="Table Grid 2" w:semiHidden="1" w:unhideWhenUsed="1"/>
+    <w:lsdException w:name="Table Grid 3" w:semiHidden="1" w:unhideWhenUsed="1"/>
+    <w:lsdException w:name="Table Grid 4" w:semiHidden="1" w:unhideWhenUsed="1"/>
+    <w:lsdException w:name="Table Grid 5" w:semiHidden="1" w:unhideWhenUsed="1"/>
+    <w:lsdException w:name="Table Grid 6" w:semiHidden="1" w:unhideWhenUsed="1"/>
+    <w:lsdException w:name="Table Grid 7" w:semiHidden="1" w:unhideWhenUsed="1"/>
+    <w:lsdException w:name="Table Grid 8" w:semiHidden="1" w:unhideWhenUsed="1"/>
+    <w:lsdException w:name="Table List 1" w:semiHidden="1" w:unhideWhenUsed="1"/>
+    <w:lsdException w:name="Table List 2" w:semiHidden="1" w:unhideWhenUsed="1"/>
+    <w:lsdException w:name="Table List 3" w:semiHidden="1" w:unhideWhenUsed="1"/>
+    <w:lsdException w:name="Table List 4" w:semiHidden="1" w:unhideWhenUsed="1"/>
+    <w:lsdException w:name="Table List 5" w:semiHidden="1" w:unhideWhenUsed="1"/>
+    <w:lsdException w:name="Table List 6" w:semiHidden="1" w:unhideWhenUsed="1"/>
+    <w:lsdException w:name="Table List 7" w:semiHidden="1" w:unhideWhenUsed="1"/>
+    <w:lsdException w:name="Table List 8" w:semiHidden="1" w:unhideWhenUsed="1"/>
+    <w:lsdException w:name="Table 3D effects 1" w:semiHidden="1" w:unhideWhenUsed="1"/>
+    <w:lsdException w:name="Table 3D effects 2" w:semiHidden="1" w:unhideWhenUsed="1"/>
+    <w:lsdException w:name="Table 3D effects 3" w:semiHidden="1" w:unhideWhenUsed="1"/>
+    <w:lsdException w:name="Table Contemporary" w:semiHidden="1" w:unhideWhenUsed="1"/>
+    <w:lsdException w:name="Table Elegant" w:semiHidden="1" w:unhideWhenUsed="1"/>
+    <w:lsdException w:name="Table Professional" w:semiHidden="1" w:unhideWhenUsed="1"/>
+    <w:lsdException w:name="Table Subtle 1" w:semiHidden="1" w:unhideWhenUsed="1"/>
+    <w:lsdException w:name="Table Subtle 2" w:semiHidden="1" w:unhideWhenUsed="1"/>
+    <w:lsdException w:name="Table Web 1" w:semiHidden="1" w:unhideWhenUsed="1"/>
+    <w:lsdException w:name="Table Web 2" w:semiHidden="1" w:unhideWhenUsed="1"/>
+    <w:lsdException w:name="Table Web 3" w:semiHidden="1" w:unhideWhenUsed="1"/>
+    <w:lsdException w:name="Balloon Text" w:semiHidden="1" w:unhideWhenUsed="1"/>
+    <w:lsdException w:name="Table Grid" w:uiPriority="39"/>
+    <w:lsdException w:name="Table Theme" w:semiHidden="1" w:unhideWhenUsed="1"/>
+    <w:lsdException w:name="Placeholder Text" w:semiHidden="1"/>
+    <w:lsdException w:name="No Spacing" w:uiPriority="1" w:qFormat="1"/>
+    <w:lsdException w:name="Light Shading" w:uiPriority="60"/>
+    <w:lsdException w:name="Light List" w:uiPriority="61"/>
+    <w:lsdException w:name="Light Grid" w:uiPriority="62"/>
+    <w:lsdException w:name="Medium Shading 1" w:uiPriority="63"/>
+    <w:lsdException w:name="Medium Shading 2" w:uiPriority="64"/>
+    <w:lsdException w:name="Medium List 1" w:uiPriority="65"/>
+    <w:lsdException w:name="Medium List 2" w:uiPriority="66"/>
+    <w:lsdException w:name="Medium Grid 1" w:uiPriority="67"/>
+    <w:lsdException w:name="Medium Grid 2" w:uiPriority="68"/>
+    <w:lsdException w:name="Medium Grid 3" w:uiPriority="69"/>
+    <w:lsdException w:name="Dark List" w:uiPriority="70"/>
+    <w:lsdException w:name="Colorful Shading" w:uiPriority="71"/>
+    <w:lsdException w:name="Colorful List" w:uiPriority="72"/>
+    <w:lsdException w:name="Colorful Grid" w:uiPriority="73"/>
+    <w:lsdException w:name="Light Shading Accent 1" w:uiPriority="60"/>
+    <w:lsdException w:name="Light List Accent 1" w:uiPriority="61"/>
+    <w:lsdException w:name="Light Grid Accent 1" w:uiPriority="62"/>
+    <w:lsdException w:name="Medium Shading 1 Accent 1" w:uiPriority="63"/>
+    <w:lsdException w:name="Medium Shading 2 Accent 1" w:uiPriority="64"/>
+    <w:lsdException w:name="Medium List 1 Accent 1" w:uiPriority="65"/>
+    <w:lsdException w:name="Revision" w:semiHidden="1"/>
+    <w:lsdException w:name="List Paragraph" w:uiPriority="34" w:qFormat="1"/>
+    <w:lsdException w:name="Quote" w:uiPriority="29" w:qFormat="1"/>
+    <w:lsdException w:name="Intense Quote" w:uiPriority="30" w:qFormat="1"/>
+    <w:lsdException w:name="Medium List 2 Accent 1" w:uiPriority="66"/>
+    <w:lsdException w:name="Medium Grid 1 Accent 1" w:uiPriority="67"/>
+    <w:lsdException w:name="Medium Grid 2 Accent 1" w:uiPriority="68"/>
+    <w:lsdException w:name="Medium Grid 3 Accent 1" w:uiPriority="69"/>
+    <w:lsdException w:name="Dark List Accent 1" w:uiPriority="70"/>
+    <w:lsdException w:name="Colorful Shading Accent 1" w:uiPriority="71"/>
+    <w:lsdException w:name="Colorful List Accent 1" w:uiPriority="72"/>
+    <w:lsdException w:name="Colorful Grid Accent 1" w:uiPriority="73"/>
+    <w:lsdException w:name="Light Shading Accent 2" w:uiPriority="60"/>
+    <w:lsdException w:name="Light List Accent 2" w:uiPriority="61"/>
+    <w:lsdException w:name="Light Grid Accent 2" w:uiPriority="62"/>
+    <w:lsdException w:name="Medium Shading 1 Accent 2" w:uiPriority="63"/>
+    <w:lsdException w:name="Medium Shading 2 Accent 2" w:uiPriority="64"/>
+    <w:lsdException w:name="Medium List 1 Accent 2" w:uiPriority="65"/>
+    <w:lsdException w:name="Medium List 2 Accent 2" w:uiPriority="66"/>
+    <w:lsdException w:name="Medium Grid 1 Accent 2" w:uiPriority="67"/>
+    <w:lsdException w:name="Medium Grid 2 Accent 2" w:uiPriority="68"/>
+    <w:lsdException w:name="Medium Grid 3 Accent 2" w:uiPriority="69"/>
+    <w:lsdException w:name="Dark List Accent 2" w:uiPriority="70"/>
+    <w:lsdException w:name="Colorful Shading Accent 2" w:uiPriority="71"/>
+    <w:lsdException w:name="Colorful List Accent 2" w:uiPriority="72"/>
+    <w:lsdException w:name="Colorful Grid Accent 2" w:uiPriority="73"/>
+    <w:lsdException w:name="Light Shading Accent 3" w:uiPriority="60"/>
+    <w:lsdException w:name="Light List Accent 3" w:uiPriority="61"/>
+    <w:lsdException w:name="Light Grid Accent 3" w:uiPriority="62"/>
+    <w:lsdException w:name="Medium Shading 1 Accent 3" w:uiPriority="63"/>
+    <w:lsdException w:name="Medium Shading 2 Accent 3" w:uiPriority="64"/>
+    <w:lsdException w:name="Medium List 1 Accent 3" w:uiPriority="65"/>
+    <w:lsdException w:name="Medium List 2 Accent 3" w:uiPriority="66"/>
+    <w:lsdException w:name="Medium Grid 1 Accent 3" w:uiPriority="67"/>
+    <w:lsdException w:name="Medium Grid 2 Accent 3" w:uiPriority="68"/>
+    <w:lsdException w:name="Medium Grid 3 Accent 3" w:uiPriority="69"/>
+    <w:lsdException w:name="Dark List Accent 3" w:uiPriority="70"/>
+    <w:lsdException w:name="Colorful Shading Accent 3" w:uiPriority="71"/>
+    <w:lsdException w:name="Colorful List Accent 3" w:uiPriority="72"/>
+    <w:lsdException w:name="Colorful Grid Accent 3" w:uiPriority="73"/>
+    <w:lsdException w:name="Light Shading Accent 4" w:uiPriority="60"/>
+    <w:lsdException w:name="Light List Accent 4" w:uiPriority="61"/>
+    <w:lsdException w:name="Light Grid Accent 4" w:uiPriority="62"/>
+    <w:lsdException w:name="Medium Shading 1 Accent 4" w:uiPriority="63"/>
+    <w:lsdException w:name="Medium Shading 2 Accent 4" w:uiPriority="64"/>
+    <w:lsdException w:name="Medium List 1 Accent 4" w:uiPriority="65"/>
+    <w:lsdException w:name="Medium List 2 Accent 4" w:uiPriority="66"/>
+    <w:lsdException w:name="Medium Grid 1 Accent 4" w:uiPriority="67"/>
+    <w:lsdException w:name="Medium Grid 2 Accent 4" w:uiPriority="68"/>
+    <w:lsdException w:name="Medium Grid 3 Accent 4" w:uiPriority="69"/>
+    <w:lsdException w:name="Dark List Accent 4" w:uiPriority="70"/>
+    <w:lsdException w:name="Colorful Shading Accent 4" w:uiPriority="71"/>
+    <w:lsdException w:name="Colorful List Accent 4" w:uiPriority="72"/>
+    <w:lsdException w:name="Colorful Grid Accent 4" w:uiPriority="73"/>
+    <w:lsdException w:name="Light Shading Accent 5" w:uiPriority="60"/>
+    <w:lsdException w:name="Light List Accent 5" w:uiPriority="61"/>
+    <w:lsdException w:name="Light Grid Accent 5" w:uiPriority="62"/>
+    <w:lsdException w:name="Medium Shading 1 Accent 5" w:uiPriority="63"/>
+    <w:lsdException w:name="Medium Shading 2 Accent 5" w:uiPriority="64"/>
+    <w:lsdException w:name="Medium List 1 Accent 5" w:uiPriority="65"/>
+    <w:lsdException w:name="Medium List 2 Accent 5" w:uiPriority="66"/>
+    <w:lsdException w:name="Medium Grid 1 Accent 5" w:uiPriority="67"/>
+    <w:lsdException w:name="Medium Grid 2 Accent 5" w:uiPriority="68"/>
+    <w:lsdException w:name="Medium Grid 3 Accent 5" w:uiPriority="69"/>
+    <w:lsdException w:name="Dark List Accent 5" w:uiPriority="70"/>
+    <w:lsdException w:name="Colorful Shading Accent 5" w:uiPriority="71"/>
+    <w:lsdException w:name="Colorful List Accent 5" w:uiPriority="72"/>
+    <w:lsdException w:name="Colorful Grid Accent 5" w:uiPriority="73"/>
+    <w:lsdException w:name="Light Shading Accent 6" w:uiPriority="60"/>
+    <w:lsdException w:name="Light List Accent 6" w:uiPriority="61"/>
+    <w:lsdException w:name="Light Grid Accent 6" w:uiPriority="62"/>
+    <w:lsdException w:name="Medium Shading 1 Accent 6" w:uiPriority="63"/>
+    <w:lsdException w:name="Medium Shading 2 Accent 6" w:uiPriority="64"/>
+    <w:lsdException w:name="Medium List 1 Accent 6" w:uiPriority="65"/>
+    <w:lsdException w:name="Medium List 2 Accent 6" w:uiPriority="66"/>
+    <w:lsdException w:name="Medium Grid 1 Accent 6" w:uiPriority="67"/>
+    <w:lsdException w:name="Medium Grid 2 Accent 6" w:uiPriority="68"/>
+    <w:lsdException w:name="Medium Grid 3 Accent 6" w:uiPriority="69"/>
+    <w:lsdException w:name="Dark List Accent 6" w:uiPriority="70"/>
+    <w:lsdException w:name="Colorful Shading Accent 6" w:uiPriority="71"/>
+    <w:lsdException w:name="Colorful List Accent 6" w:uiPriority="72"/>
+    <w:lsdException w:name="Colorful Grid Accent 6" w:uiPriority="73"/>
+    <w:lsdException w:name="Subtle Emphasis" w:uiPriority="19" w:qFormat="1"/>
+    <w:lsdException w:name="Intense Emphasis" w:uiPriority="21" w:qFormat="1"/>
+    <w:lsdException w:name="Subtle Reference" w:uiPriority="31" w:qFormat="1"/>
+    <w:lsdException w:name="Intense Reference" w:uiPriority="32" w:qFormat="1"/>
+    <w:lsdException w:name="Book Title" w:uiPriority="33" w:qFormat="1"/>
+    <w:lsdException w:name="Bibliography" w:semiHidden="1" w:uiPriority="37" w:unhideWhenUsed="1"/>
+    <w:lsdException w:name="TOC Heading" w:semiHidden="1" w:uiPriority="39" w:unhideWhenUsed="1" w:qFormat="1"/>
+    <w:lsdException w:name="Plain Table 1" w:uiPriority="41"/>
+    <w:lsdException w:name="Plain Table 2" w:uiPriority="42"/>
+    <w:lsdException w:name="Plain Table 3" w:uiPriority="43"/>
+    <w:lsdException w:name="Plain Table 4" w:uiPriority="44"/>
+    <w:lsdException w:name="Plain Table 5" w:uiPriority="45"/>
+    <w:lsdException w:name="Grid Table Light" w:uiPriority="40"/>
+    <w:lsdException w:name="Grid Table 1 Light" w:uiPriority="46"/>
+    <w:lsdException w:name="Grid Table 2" w:uiPriority="47"/>
+    <w:lsdException w:name="Grid Table 3" w:uiPriority="48"/>
+    <w:lsdException w:name="Grid Table 4" w:uiPriority="49"/>
+    <w:lsdException w:name="Grid Table 5 Dark" w:uiPriority="50"/>
+    <w:lsdException w:name="Grid Table 6 Colorful" w:uiPriority="51"/>
+    <w:lsdException w:name="Grid Table 7 Colorful" w:uiPriority="52"/>
+    <w:lsdException w:name="Grid Table 1 Light Accent 1" w:uiPriority="46"/>
+    <w:lsdException w:name="Grid Table 2 Accent 1" w:uiPriority="47"/>
+    <w:lsdException w:name="Grid Table 3 Accent 1" w:uiPriority="48"/>
+    <w:lsdException w:name="Grid Table 4 Accent 1" w:uiPriority="49"/>
+    <w:lsdException w:name="Grid Table 5 Dark Accent 1" w:uiPriority="50"/>
+    <w:lsdException w:name="Grid Table 6 Colorful Accent 1" w:uiPriority="51"/>
+    <w:lsdException w:name="Grid Table 7 Colorful Accent 1" w:uiPriority="52"/>
+    <w:lsdException w:name="Grid Table 1 Light Accent 2" w:uiPriority="46"/>
+    <w:lsdException w:name="Grid Table 2 Accent 2" w:uiPriority="47"/>
+    <w:lsdException w:name="Grid Table 3 Accent 2" w:uiPriority="48"/>
+    <w:lsdException w:name="Grid Table 4 Accent 2" w:uiPriority="49"/>
+    <w:lsdException w:name="Grid Table 5 Dark Accent 2" w:uiPriority="50"/>
+    <w:lsdException w:name="Grid Table 6 Colorful Accent 2" w:uiPriority="51"/>
+    <w:lsdException w:name="Grid Table 7 Colorful Accent 2" w:uiPriority="52"/>
+    <w:lsdException w:name="Grid Table 1 Light Accent 3" w:uiPriority="46"/>
+    <w:lsdException w:name="Grid Table 2 Accent 3" w:uiPriority="47"/>
+    <w:lsdException w:name="Grid Table 3 Accent 3" w:uiPriority="48"/>
+    <w:lsdException w:name="Grid Table 4 Accent 3" w:uiPriority="49"/>
+    <w:lsdException w:name="Grid Table 5 Dark Accent 3" w:uiPriority="50"/>
+    <w:lsdException w:name="Grid Table 6 Colorful Accent 3" w:uiPriority="51"/>
+    <w:lsdException w:name="Grid Table 7 Colorful Accent 3" w:uiPriority="52"/>
+    <w:lsdException w:name="Grid Table 1 Light Accent 4" w:uiPriority="46"/>
+    <w:lsdException w:name="Grid Table 2 Accent 4" w:uiPriority="47"/>
+    <w:lsdException w:name="Grid Table 3 Accent 4" w:uiPriority="48"/>
+    <w:lsdException w:name="Grid Table 4 Accent 4" w:uiPriority="49"/>
+    <w:lsdException w:name="Grid Table 5 Dark Accent 4" w:uiPriority="50"/>
+    <w:lsdException w:name="Grid Table 6 Colorful Accent 4" w:uiPriority="51"/>
+    <w:lsdException w:name="Grid Table 7 Colorful Accent 4" w:uiPriority="52"/>
+    <w:lsdException w:name="Grid Table 1 Light Accent 5" w:uiPriority="46"/>
+    <w:lsdException w:name="Grid Table 2 Accent 5" w:uiPriority="47"/>
+    <w:lsdException w:name="Grid Table 3 Accent 5" w:uiPriority="48"/>
+    <w:lsdException w:name="Grid Table 4 Accent 5" w:uiPriority="49"/>
+    <w:lsdException w:name="Grid Table 5 Dark Accent 5" w:uiPriority="50"/>
+    <w:lsdException w:name="Grid Table 6 Colorful Accent 5" w:uiPriority="51"/>
+    <w:lsdException w:name="Grid Table 7 Colorful Accent 5" w:uiPriority="52"/>
+    <w:lsdException w:name="Grid Table 1 Light Accent 6" w:uiPriority="46"/>
+    <w:lsdException w:name="Grid Table 2 Accent 6" w:uiPriority="47"/>
+    <w:lsdException w:name="Grid Table 3 Accent 6" w:uiPriority="48"/>
+    <w:lsdException w:name="Grid Table 4 Accent 6" w:uiPriority="49"/>
+    <w:lsdException w:name="Grid Table 5 Dark Accent 6" w:uiPriority="50"/>
+    <w:lsdException w:name="Grid Table 6 Colorful Accent 6" w:uiPriority="51"/>
+    <w:lsdException w:name="Grid Table 7 Colorful Accent 6" w:uiPriority="52"/>
+    <w:lsdException w:name="List Table 1 Light" w:uiPriority="46"/>
+    <w:lsdException w:name="List Table 2" w:uiPriority="47"/>
+    <w:lsdException w:name="List Table 3" w:uiPriority="48"/>
+    <w:lsdException w:name="List Table 4" w:uiPriority="49"/>
+    <w:lsdException w:name="List Table 5 Dark" w:uiPriority="50"/>
+    <w:lsdException w:name="List Table 6 Colorful" w:uiPriority="51"/>
+    <w:lsdException w:name="List Table 7 Colorful" w:uiPriority="52"/>
+    <w:lsdException w:name="List Table 1 Light Accent 1" w:uiPriority="46"/>
+    <w:lsdException w:name="List Table 2 Accent 1" w:uiPriority="47"/>
+    <w:lsdException w:name="List Table 3 Accent 1" w:uiPriority="48"/>
+    <w:lsdException w:name="List Table 4 Accent 1" w:uiPriority="49"/>
+    <w:lsdException w:name="List Table 5 Dark Accent 1" w:uiPriority="50"/>
+    <w:lsdException w:name="List Table 6 Colorful Accent 1" w:uiPriority="51"/>
+    <w:lsdException w:name="List Table 7 Colorful Accent 1" w:uiPriority="52"/>
+    <w:lsdException w:name="List Table 1 Light Accent 2" w:uiPriority="46"/>
+    <w:lsdException w:name="List Table 2 Accent 2" w:uiPriority="47"/>
+    <w:lsdException w:name="List Table 3 Accent 2" w:uiPriority="48"/>
+    <w:lsdException w:name="List Table 4 Accent 2" w:uiPriority="49"/>
+    <w:lsdException w:name="List Table 5 Dark Accent 2" w:uiPriority="50"/>
+    <w:lsdException w:name="List Table 6 Colorful Accent 2" w:uiPriority="51"/>
+    <w:lsdException w:name="List Table 7 Colorful Accent 2" w:uiPriority="52"/>
+    <w:lsdException w:name="List Table 1 Light Accent 3" w:uiPriority="46"/>
+    <w:lsdException w:name="List Table 2 Accent 3" w:uiPriority="47"/>
+    <w:lsdException w:name="List Table 3 Accent 3" w:uiPriority="48"/>
+    <w:lsdException w:name="List Table 4 Accent 3" w:uiPriority="49"/>
+    <w:lsdException w:name="List Table 5 Dark Accent 3" w:uiPriority="50"/>
+    <w:lsdException w:name="List Table 6 Colorful Accent 3" w:uiPriority="51"/>
+    <w:lsdException w:name="List Table 7 Colorful Accent 3" w:uiPriority="52"/>
+    <w:lsdException w:name="List Table 1 Light Accent 4" w:uiPriority="46"/>
+    <w:lsdException w:name="List Table 2 Accent 4" w:uiPriority="47"/>
+    <w:lsdException w:name="List Table 3 Accent 4" w:uiPriority="48"/>
+    <w:lsdException w:name="List Table 4 Accent 4" w:uiPriority="49"/>
+    <w:lsdException w:name="List Table 5 Dark Accent 4" w:uiPriority="50"/>
+    <w:lsdException w:name="List Table 6 Colorful Accent 4" w:uiPriority="51"/>
+    <w:lsdException w:name="List Table 7 Colorful Accent 4" w:uiPriority="52"/>
+    <w:lsdException w:name="List Table 1 Light Accent 5" w:uiPriority="46"/>
+    <w:lsdException w:name="List Table 2 Accent 5" w:uiPriority="47"/>
+    <w:lsdException w:name="List Table 3 Accent 5" w:uiPriority="48"/>
+    <w:lsdException w:name="List Table 4 Accent 5" w:uiPriority="49"/>
+    <w:lsdException w:name="List Table 5 Dark Accent 5" w:uiPriority="50"/>
+    <w:lsdException w:name="List Table 6 Colorful Accent 5" w:uiPriority="51"/>
+    <w:lsdException w:name="List Table 7 Colorful Accent 5" w:uiPriority="52"/>
+    <w:lsdException w:name="List Table 1 Light Accent 6" w:uiPriority="46"/>
+    <w:lsdException w:name="List Table 2 Accent 6" w:uiPriority="47"/>
+    <w:lsdException w:name="List Table 3 Accent 6" w:uiPriority="48"/>
+    <w:lsdException w:name="List Table 4 Accent 6" w:uiPriority="49"/>
+    <w:lsdException w:name="List Table 5 Dark Accent 6" w:uiPriority="50"/>
+    <w:lsdException w:name="List Table 6 Colorful Accent 6" w:uiPriority="51"/>
+    <w:lsdException w:name="List Table 7 Colorful Accent 6" w:uiPriority="52"/>
+    <w:lsdException w:name="Mention" w:semiHidden="1" w:unhideWhenUsed="1"/>
+    <w:lsdException w:name="Smart Hyperlink" w:semiHidden="1" w:unhideWhenUsed="1"/>
+    <w:lsdException w:name="Hashtag" w:semiHidden="1" w:unhideWhenUsed="1"/>
+    <w:lsdException w:name="Unresolved Mention" w:semiHidden="1" w:unhideWhenUsed="1"/>
+    <w:lsdException w:name="Smart Link" w:semiHidden="1" w:unhideWhenUsed="1"/>
+  </w:latentStyles>
+  <w:style w:type="paragraph" w:default="1" w:styleId="Normal">
     <w:name w:val="Normal"/>
+    <w:qFormat/>
     <w:pPr>
-      <w:spacing w:after="160" w:line="276" w:lineRule="auto"/>
+      <w:spacing w:line="276" w:lineRule="auto"/>
     </w:pPr>
-    <w:rPr>
-      <w:rFonts w:ascii="Calibri" w:hAnsi="Calibri"/>
-      <w:sz w:val="24"/>
-      <w:szCs w:val="24"/>
-    </w:rPr>
   </w:style>
   <w:style w:type="paragraph" w:styleId="Heading1">
     <w:name w:val="heading 1"/>
     <w:basedOn w:val="Normal"/>
     <w:next w:val="Normal"/>
+    <w:uiPriority w:val="9"/>
+    <w:qFormat/>
     <w:pPr>
+      <w:keepNext/>
+      <w:spacing w:before="480"/>
       <w:outlineLvl w:val="0"/>
-      <w:spacing w:before="480" w:after="160"/>
-      <w:keepNext/>
     </w:pPr>
     <w:rPr>
       <w:b/>
-      <w:rFonts w:ascii="Calibri" w:hAnsi="Calibri"/>
+      <w:color w:val="1F3864"/>
       <w:sz w:val="36"/>
       <w:szCs w:val="36"/>
-      <w:color w:val="1F3864"/>
     </w:rPr>
   </w:style>
   <w:style w:type="paragraph" w:styleId="Heading2">
     <w:name w:val="heading 2"/>
     <w:basedOn w:val="Normal"/>
     <w:next w:val="Normal"/>
+    <w:uiPriority w:val="9"/>
+    <w:unhideWhenUsed/>
+    <w:qFormat/>
     <w:pPr>
+      <w:keepNext/>
+      <w:spacing w:before="320" w:after="120"/>
       <w:outlineLvl w:val="1"/>
-      <w:spacing w:before="320" w:after="120"/>
-      <w:keepNext/>
     </w:pPr>
     <w:rPr>
       <w:b/>
-      <w:rFonts w:ascii="Calibri" w:hAnsi="Calibri"/>
+      <w:color w:val="2E74B5"/>
       <w:sz w:val="28"/>
       <w:szCs w:val="28"/>
-      <w:color w:val="2E74B5"/>
     </w:rPr>
+  </w:style>
+  <w:style w:type="character" w:default="1" w:styleId="DefaultParagraphFont">
+    <w:name w:val="Default Paragraph Font"/>
+    <w:uiPriority w:val="1"/>
+    <w:semiHidden/>
+    <w:unhideWhenUsed/>
+  </w:style>
+  <w:style w:type="table" w:default="1" w:styleId="TableNormal">
+    <w:name w:val="Normal Table"/>
+    <w:uiPriority w:val="99"/>
+    <w:semiHidden/>
+    <w:unhideWhenUsed/>
+    <w:tblPr>
+      <w:tblInd w:w="0" w:type="dxa"/>
+      <w:tblCellMar>
+        <w:top w:w="0" w:type="dxa"/>
+        <w:left w:w="108" w:type="dxa"/>
+        <w:bottom w:w="0" w:type="dxa"/>
+        <w:right w:w="108" w:type="dxa"/>
+      </w:tblCellMar>
+    </w:tblPr>
+  </w:style>
+  <w:style w:type="numbering" w:default="1" w:styleId="NoList">
+    <w:name w:val="No List"/>
+    <w:uiPriority w:val="99"/>
+    <w:semiHidden/>
+    <w:unhideWhenUsed/>
   </w:style>
   <w:style w:type="paragraph" w:styleId="Title">
     <w:name w:val="Title"/>
     <w:basedOn w:val="Normal"/>
+    <w:uiPriority w:val="10"/>
+    <w:qFormat/>
     <w:pPr>
+      <w:spacing w:after="240"/>
       <w:jc w:val="center"/>
-      <w:spacing w:before="0" w:after="240"/>
     </w:pPr>
     <w:rPr>
       <w:b/>
-      <w:rFonts w:ascii="Calibri" w:hAnsi="Calibri"/>
+      <w:color w:val="1F3864"/>
       <w:sz w:val="56"/>
       <w:szCs w:val="56"/>
-      <w:color w:val="1F3864"/>
     </w:rPr>
   </w:style>
   <w:style w:type="paragraph" w:styleId="Subtitle">
     <w:name w:val="Subtitle"/>
     <w:basedOn w:val="Normal"/>
+    <w:uiPriority w:val="11"/>
+    <w:qFormat/>
     <w:pPr>
       <w:jc w:val="center"/>
-      <w:spacing w:after="160"/>
     </w:pPr>
     <w:rPr>
       <w:i/>
-      <w:rFonts w:ascii="Calibri" w:hAnsi="Calibri"/>
+      <w:color w:val="595959"/>
       <w:sz w:val="32"/>
       <w:szCs w:val="32"/>
-      <w:color w:val="595959"/>
     </w:rPr>
   </w:style>
   <w:style w:type="paragraph" w:styleId="ListBullet">
     <w:name w:val="List Bullet"/>
     <w:basedOn w:val="Normal"/>
     <w:pPr>
-      <w:spacing w:after="80"/>
       <w:numPr>
-        <w:ilvl w:val="0"/>
         <w:numId w:val="1"/>
       </w:numPr>
+      <w:spacing w:after="80"/>
     </w:pPr>
   </w:style>
   <w:style w:type="paragraph" w:styleId="ListNumber">
     <w:name w:val="List Number"/>
     <w:basedOn w:val="Normal"/>
     <w:pPr>
-      <w:spacing w:after="80"/>
       <w:numPr>
-        <w:ilvl w:val="0"/>
         <w:numId w:val="2"/>
       </w:numPr>
+      <w:spacing w:after="80"/>
     </w:pPr>
   </w:style>
-  <w:style w:type="paragraph" w:styleId="CodeBlock">
+  <w:style w:type="paragraph" w:customStyle="1" w:styleId="CodeBlock">
     <w:name w:val="Code Block"/>
     <w:basedOn w:val="Normal"/>
     <w:pPr>
+      <w:shd w:val="clear" w:color="auto" w:fill="F2F2F2"/>
       <w:spacing w:before="120" w:after="120"/>
-      <w:shd w:val="clear" w:color="auto" w:fill="F2F2F2"/>
     </w:pPr>
     <w:rPr>
       <w:rFonts w:ascii="Courier New" w:hAnsi="Courier New"/>
+      <w:color w:val="333333"/>
       <w:sz w:val="20"/>
       <w:szCs w:val="20"/>
-      <w:color w:val="333333"/>
     </w:rPr>
   </w:style>
   <w:style w:type="table" w:styleId="TableGrid">
@@ -1375,7 +2122,334 @@
         <w:insideH w:val="single" w:sz="4" w:space="0" w:color="BFBFBF"/>
         <w:insideV w:val="single" w:sz="4" w:space="0" w:color="BFBFBF"/>
       </w:tblBorders>
+      <w:tblCellMar>
+        <w:top w:w="0" w:type="dxa"/>
+        <w:left w:w="0" w:type="dxa"/>
+        <w:bottom w:w="0" w:type="dxa"/>
+        <w:right w:w="0" w:type="dxa"/>
+      </w:tblCellMar>
     </w:tblPr>
   </w:style>
 </w:styles>
+</file>
+
+<file path=word/theme/theme1.xml><?xml version="1.0" encoding="utf-8"?>
+<a:theme xmlns:a="http://schemas.openxmlformats.org/drawingml/2006/main" name="Office Theme">
+  <a:themeElements>
+    <a:clrScheme name="Office">
+      <a:dk1>
+        <a:sysClr val="windowText" lastClr="000000"/>
+      </a:dk1>
+      <a:lt1>
+        <a:sysClr val="window" lastClr="FFFFFF"/>
+      </a:lt1>
+      <a:dk2>
+        <a:srgbClr val="0E2841"/>
+      </a:dk2>
+      <a:lt2>
+        <a:srgbClr val="E8E8E8"/>
+      </a:lt2>
+      <a:accent1>
+        <a:srgbClr val="156082"/>
+      </a:accent1>
+      <a:accent2>
+        <a:srgbClr val="E97132"/>
+      </a:accent2>
+      <a:accent3>
+        <a:srgbClr val="196B24"/>
+      </a:accent3>
+      <a:accent4>
+        <a:srgbClr val="0F9ED5"/>
+      </a:accent4>
+      <a:accent5>
+        <a:srgbClr val="A02B93"/>
+      </a:accent5>
+      <a:accent6>
+        <a:srgbClr val="4EA72E"/>
+      </a:accent6>
+      <a:hlink>
+        <a:srgbClr val="467886"/>
+      </a:hlink>
+      <a:folHlink>
+        <a:srgbClr val="96607D"/>
+      </a:folHlink>
+    </a:clrScheme>
+    <a:fontScheme name="Office">
+      <a:majorFont>
+        <a:latin typeface="Aptos Display" panose="02110004020202020204"/>
+        <a:ea typeface=""/>
+        <a:cs typeface=""/>
+        <a:font script="Jpan" typeface="游ゴシック Light"/>
+        <a:font script="Hang" typeface="맑은 고딕"/>
+        <a:font script="Hans" typeface="等线 Light"/>
+        <a:font script="Hant" typeface="新細明體"/>
+        <a:font script="Arab" typeface="Times New Roman"/>
+        <a:font script="Hebr" typeface="Times New Roman"/>
+        <a:font script="Thai" typeface="Angsana New"/>
+        <a:font script="Ethi" typeface="Nyala"/>
+        <a:font script="Beng" typeface="Vrinda"/>
+        <a:font script="Gujr" typeface="Shruti"/>
+        <a:font script="Khmr" typeface="MoolBoran"/>
+        <a:font script="Knda" typeface="Tunga"/>
+        <a:font script="Guru" typeface="Raavi"/>
+        <a:font script="Cans" typeface="Euphemia"/>
+        <a:font script="Cher" typeface="Plantagenet Cherokee"/>
+        <a:font script="Yiii" typeface="Microsoft Yi Baiti"/>
+        <a:font script="Tibt" typeface="Microsoft Himalaya"/>
+        <a:font script="Thaa" typeface="MV Boli"/>
+        <a:font script="Deva" typeface="Mangal"/>
+        <a:font script="Telu" typeface="Gautami"/>
+        <a:font script="Taml" typeface="Latha"/>
+        <a:font script="Syrc" typeface="Estrangelo Edessa"/>
+        <a:font script="Orya" typeface="Kalinga"/>
+        <a:font script="Mlym" typeface="Kartika"/>
+        <a:font script="Laoo" typeface="DokChampa"/>
+        <a:font script="Sinh" typeface="Iskoola Pota"/>
+        <a:font script="Mong" typeface="Mongolian Baiti"/>
+        <a:font script="Viet" typeface="Times New Roman"/>
+        <a:font script="Uigh" typeface="Microsoft Uighur"/>
+        <a:font script="Geor" typeface="Sylfaen"/>
+        <a:font script="Armn" typeface="Arial"/>
+        <a:font script="Bugi" typeface="Leelawadee UI"/>
+        <a:font script="Bopo" typeface="Microsoft JhengHei"/>
+        <a:font script="Java" typeface="Javanese Text"/>
+        <a:font script="Lisu" typeface="Segoe UI"/>
+        <a:font script="Mymr" typeface="Myanmar Text"/>
+        <a:font script="Nkoo" typeface="Ebrima"/>
+        <a:font script="Olck" typeface="Nirmala UI"/>
+        <a:font script="Osma" typeface="Ebrima"/>
+        <a:font script="Phag" typeface="Phagspa"/>
+        <a:font script="Syrn" typeface="Estrangelo Edessa"/>
+        <a:font script="Syrj" typeface="Estrangelo Edessa"/>
+        <a:font script="Syre" typeface="Estrangelo Edessa"/>
+        <a:font script="Sora" typeface="Nirmala UI"/>
+        <a:font script="Tale" typeface="Microsoft Tai Le"/>
+        <a:font script="Talu" typeface="Microsoft New Tai Lue"/>
+        <a:font script="Tfng" typeface="Ebrima"/>
+      </a:majorFont>
+      <a:minorFont>
+        <a:latin typeface="Aptos" panose="02110004020202020204"/>
+        <a:ea typeface=""/>
+        <a:cs typeface=""/>
+        <a:font script="Jpan" typeface="游明朝"/>
+        <a:font script="Hang" typeface="맑은 고딕"/>
+        <a:font script="Hans" typeface="等线"/>
+        <a:font script="Hant" typeface="新細明體"/>
+        <a:font script="Arab" typeface="Arial"/>
+        <a:font script="Hebr" typeface="Arial"/>
+        <a:font script="Thai" typeface="Cordia New"/>
+        <a:font script="Ethi" typeface="Nyala"/>
+        <a:font script="Beng" typeface="Vrinda"/>
+        <a:font script="Gujr" typeface="Shruti"/>
+        <a:font script="Khmr" typeface="DaunPenh"/>
+        <a:font script="Knda" typeface="Tunga"/>
+        <a:font script="Guru" typeface="Raavi"/>
+        <a:font script="Cans" typeface="Euphemia"/>
+        <a:font script="Cher" typeface="Plantagenet Cherokee"/>
+        <a:font script="Yiii" typeface="Microsoft Yi Baiti"/>
+        <a:font script="Tibt" typeface="Microsoft Himalaya"/>
+        <a:font script="Thaa" typeface="MV Boli"/>
+        <a:font script="Deva" typeface="Mangal"/>
+        <a:font script="Telu" typeface="Gautami"/>
+        <a:font script="Taml" typeface="Latha"/>
+        <a:font script="Syrc" typeface="Estrangelo Edessa"/>
+        <a:font script="Orya" typeface="Kalinga"/>
+        <a:font script="Mlym" typeface="Kartika"/>
+        <a:font script="Laoo" typeface="DokChampa"/>
+        <a:font script="Sinh" typeface="Iskoola Pota"/>
+        <a:font script="Mong" typeface="Mongolian Baiti"/>
+        <a:font script="Viet" typeface="Arial"/>
+        <a:font script="Uigh" typeface="Microsoft Uighur"/>
+        <a:font script="Geor" typeface="Sylfaen"/>
+        <a:font script="Armn" typeface="Arial"/>
+        <a:font script="Bugi" typeface="Leelawadee UI"/>
+        <a:font script="Bopo" typeface="Microsoft JhengHei"/>
+        <a:font script="Java" typeface="Javanese Text"/>
+        <a:font script="Lisu" typeface="Segoe UI"/>
+        <a:font script="Mymr" typeface="Myanmar Text"/>
+        <a:font script="Nkoo" typeface="Ebrima"/>
+        <a:font script="Olck" typeface="Nirmala UI"/>
+        <a:font script="Osma" typeface="Ebrima"/>
+        <a:font script="Phag" typeface="Phagspa"/>
+        <a:font script="Syrn" typeface="Estrangelo Edessa"/>
+        <a:font script="Syrj" typeface="Estrangelo Edessa"/>
+        <a:font script="Syre" typeface="Estrangelo Edessa"/>
+        <a:font script="Sora" typeface="Nirmala UI"/>
+        <a:font script="Tale" typeface="Microsoft Tai Le"/>
+        <a:font script="Talu" typeface="Microsoft New Tai Lue"/>
+        <a:font script="Tfng" typeface="Ebrima"/>
+      </a:minorFont>
+    </a:fontScheme>
+    <a:fmtScheme name="Office">
+      <a:fillStyleLst>
+        <a:solidFill>
+          <a:schemeClr val="phClr"/>
+        </a:solidFill>
+        <a:gradFill rotWithShape="1">
+          <a:gsLst>
+            <a:gs pos="0">
+              <a:schemeClr val="phClr">
+                <a:lumMod val="110000"/>
+                <a:satMod val="105000"/>
+                <a:tint val="67000"/>
+              </a:schemeClr>
+            </a:gs>
+            <a:gs pos="50000">
+              <a:schemeClr val="phClr">
+                <a:lumMod val="105000"/>
+                <a:satMod val="103000"/>
+                <a:tint val="73000"/>
+              </a:schemeClr>
+            </a:gs>
+            <a:gs pos="100000">
+              <a:schemeClr val="phClr">
+                <a:lumMod val="105000"/>
+                <a:satMod val="109000"/>
+                <a:tint val="81000"/>
+              </a:schemeClr>
+            </a:gs>
+          </a:gsLst>
+          <a:lin ang="5400000" scaled="0"/>
+        </a:gradFill>
+        <a:gradFill rotWithShape="1">
+          <a:gsLst>
+            <a:gs pos="0">
+              <a:schemeClr val="phClr">
+                <a:satMod val="103000"/>
+                <a:lumMod val="102000"/>
+                <a:tint val="94000"/>
+              </a:schemeClr>
+            </a:gs>
+            <a:gs pos="50000">
+              <a:schemeClr val="phClr">
+                <a:satMod val="110000"/>
+                <a:lumMod val="100000"/>
+                <a:shade val="100000"/>
+              </a:schemeClr>
+            </a:gs>
+            <a:gs pos="100000">
+              <a:schemeClr val="phClr">
+                <a:lumMod val="99000"/>
+                <a:satMod val="120000"/>
+                <a:shade val="78000"/>
+              </a:schemeClr>
+            </a:gs>
+          </a:gsLst>
+          <a:lin ang="5400000" scaled="0"/>
+        </a:gradFill>
+      </a:fillStyleLst>
+      <a:lnStyleLst>
+        <a:ln w="12700" cap="flat" cmpd="sng" algn="ctr">
+          <a:solidFill>
+            <a:schemeClr val="phClr"/>
+          </a:solidFill>
+          <a:prstDash val="solid"/>
+          <a:miter lim="800000"/>
+        </a:ln>
+        <a:ln w="19050" cap="flat" cmpd="sng" algn="ctr">
+          <a:solidFill>
+            <a:schemeClr val="phClr"/>
+          </a:solidFill>
+          <a:prstDash val="solid"/>
+          <a:miter lim="800000"/>
+        </a:ln>
+        <a:ln w="25400" cap="flat" cmpd="sng" algn="ctr">
+          <a:solidFill>
+            <a:schemeClr val="phClr"/>
+          </a:solidFill>
+          <a:prstDash val="solid"/>
+          <a:miter lim="800000"/>
+        </a:ln>
+      </a:lnStyleLst>
+      <a:effectStyleLst>
+        <a:effectStyle>
+          <a:effectLst/>
+        </a:effectStyle>
+        <a:effectStyle>
+          <a:effectLst/>
+        </a:effectStyle>
+        <a:effectStyle>
+          <a:effectLst>
+            <a:outerShdw blurRad="57150" dist="19050" dir="5400000" algn="ctr" rotWithShape="0">
+              <a:srgbClr val="000000">
+                <a:alpha val="63000"/>
+              </a:srgbClr>
+            </a:outerShdw>
+          </a:effectLst>
+        </a:effectStyle>
+      </a:effectStyleLst>
+      <a:bgFillStyleLst>
+        <a:solidFill>
+          <a:schemeClr val="phClr"/>
+        </a:solidFill>
+        <a:solidFill>
+          <a:schemeClr val="phClr">
+            <a:tint val="95000"/>
+            <a:satMod val="170000"/>
+          </a:schemeClr>
+        </a:solidFill>
+        <a:gradFill rotWithShape="1">
+          <a:gsLst>
+            <a:gs pos="0">
+              <a:schemeClr val="phClr">
+                <a:tint val="93000"/>
+                <a:satMod val="150000"/>
+                <a:shade val="98000"/>
+                <a:lumMod val="102000"/>
+              </a:schemeClr>
+            </a:gs>
+            <a:gs pos="50000">
+              <a:schemeClr val="phClr">
+                <a:tint val="98000"/>
+                <a:satMod val="130000"/>
+                <a:shade val="90000"/>
+                <a:lumMod val="103000"/>
+              </a:schemeClr>
+            </a:gs>
+            <a:gs pos="100000">
+              <a:schemeClr val="phClr">
+                <a:shade val="63000"/>
+                <a:satMod val="120000"/>
+              </a:schemeClr>
+            </a:gs>
+          </a:gsLst>
+          <a:lin ang="5400000" scaled="0"/>
+        </a:gradFill>
+      </a:bgFillStyleLst>
+    </a:fmtScheme>
+  </a:themeElements>
+  <a:objectDefaults>
+    <a:lnDef>
+      <a:spPr/>
+      <a:bodyPr/>
+      <a:lstStyle/>
+      <a:style>
+        <a:lnRef idx="2">
+          <a:schemeClr val="accent1"/>
+        </a:lnRef>
+        <a:fillRef idx="0">
+          <a:schemeClr val="accent1"/>
+        </a:fillRef>
+        <a:effectRef idx="1">
+          <a:schemeClr val="accent1"/>
+        </a:effectRef>
+        <a:fontRef idx="minor">
+          <a:schemeClr val="tx1"/>
+        </a:fontRef>
+      </a:style>
+    </a:lnDef>
+  </a:objectDefaults>
+  <a:extraClrSchemeLst/>
+  <a:extLst>
+    <a:ext uri="{05A4C25C-085E-4340-85A3-A5531E510DB2}">
+      <thm15:themeFamily xmlns:thm15="http://schemas.microsoft.com/office/thememl/2012/main" name="Office Theme" id="{2E142A2C-CD16-42D6-873A-C26D2A0506FA}" vid="{1BDDFF52-6CD6-40A5-AB3C-68EB2F1E4D0A}"/>
+    </a:ext>
+  </a:extLst>
+</a:theme>
+</file>
+
+<file path=docMetadata/LabelInfo.xml><?xml version="1.0" encoding="utf-8"?>
+<clbl:labelList xmlns:clbl="http://schemas.microsoft.com/office/2020/mipLabelMetadata">
+  <clbl:label id="{00dc3ec8-2b44-480f-851e-485198caee04}" enabled="1" method="Standard" siteId="{375b32d3-5156-4fee-bbeb-d80e209d3782}" removed="0"/>
+</clbl:labelList>
 </file>
</xml_diff>